<commit_message>
Updated a few exercises to include boards and movement
</commit_message>
<xml_diff>
--- a/Module_2_Oct_2026_v2/Oct12_session3_materials.docx
+++ b/Module_2_Oct_2026_v2/Oct12_session3_materials.docx
@@ -21,7 +21,6 @@
           <w:i w:val="false"/>
           <w:b w:val="false"/>
           <w:u w:val="none"/>
-          <w:strike w:val="false"/>
           <w:sz w:val="18"/>
           <w:szCs w:val="18"/>
           <w:color w:val="545860"/>
@@ -48,7 +47,6 @@
           <w:i w:val="false"/>
           <w:b w:val="true"/>
           <w:u w:val="none"/>
-          <w:strike w:val="false"/>
           <w:sz w:val="36"/>
           <w:szCs w:val="36"/>
           <w:color w:val="063360"/>
@@ -75,7 +73,6 @@
           <w:i w:val="true"/>
           <w:b w:val="false"/>
           <w:u w:val="none"/>
-          <w:strike w:val="false"/>
           <w:sz w:val="18"/>
           <w:szCs w:val="18"/>
           <w:color w:val="215A9E"/>
@@ -102,7 +99,6 @@
           <w:i w:val="false"/>
           <w:b w:val="false"/>
           <w:u w:val="none"/>
-          <w:strike w:val="false"/>
           <w:sz w:val="22"/>
           <w:szCs w:val="22"/>
           <w:color w:val="000000"/>
@@ -128,6 +124,7 @@
           <w:trHeight w:val="360" w:hRule="auto"/>
           <w:tblHeader/>
         </w:trPr>
+        header1
         <w:tc>
           <w:tcPr>
             <w:tcBorders>
@@ -157,24 +154,13 @@
               </w:pBdr>
               <w:spacing w:after="80" w:before="80" w:line="240"/>
               <w:ind w:left="80" w:right="80" w:firstLine="0" w:firstLineChars="0"/>
-              <w:rPr>
-                <w:rFonts w:ascii="Arial" w:hAnsi="Arial" w:eastAsia="Arial" w:cs="Arial"/>
+            </w:pPr>
+            <w:r>
+              <w:rPr>
+                <w:rFonts w:ascii="Arial" w:hAnsi="DejaVu Sans" w:eastAsia="DejaVu Sans" w:cs="DejaVu Sans"/>
                 <w:i w:val="false"/>
                 <w:b w:val="true"/>
                 <w:u w:val="none"/>
-                <w:strike w:val="false"/>
-                <w:sz w:val="21"/>
-                <w:szCs w:val="21"/>
-                <w:color w:val="063360"/>
-              </w:rPr>
-            </w:pPr>
-            <w:r>
-              <w:rPr>
-                <w:rFonts w:ascii="Arial" w:hAnsi="Arial" w:eastAsia="Arial" w:cs="Arial"/>
-                <w:i w:val="false"/>
-                <w:b w:val="true"/>
-                <w:u w:val="none"/>
-                <w:strike w:val="false"/>
                 <w:sz w:val="21"/>
                 <w:szCs w:val="21"/>
                 <w:color w:val="063360"/>
@@ -212,24 +198,13 @@
               </w:pBdr>
               <w:spacing w:after="80" w:before="80" w:line="240"/>
               <w:ind w:left="80" w:right="80" w:firstLine="0" w:firstLineChars="0"/>
-              <w:rPr>
-                <w:rFonts w:ascii="Arial" w:hAnsi="Arial" w:eastAsia="Arial" w:cs="Arial"/>
+            </w:pPr>
+            <w:r>
+              <w:rPr>
+                <w:rFonts w:ascii="Arial" w:hAnsi="DejaVu Sans" w:eastAsia="DejaVu Sans" w:cs="DejaVu Sans"/>
                 <w:i w:val="false"/>
                 <w:b w:val="true"/>
                 <w:u w:val="none"/>
-                <w:strike w:val="false"/>
-                <w:sz w:val="21"/>
-                <w:szCs w:val="21"/>
-                <w:color w:val="063360"/>
-              </w:rPr>
-            </w:pPr>
-            <w:r>
-              <w:rPr>
-                <w:rFonts w:ascii="Arial" w:hAnsi="Arial" w:eastAsia="Arial" w:cs="Arial"/>
-                <w:i w:val="false"/>
-                <w:b w:val="true"/>
-                <w:u w:val="none"/>
-                <w:strike w:val="false"/>
                 <w:sz w:val="21"/>
                 <w:szCs w:val="21"/>
                 <w:color w:val="063360"/>
@@ -267,24 +242,13 @@
               </w:pBdr>
               <w:spacing w:after="80" w:before="80" w:line="240"/>
               <w:ind w:left="80" w:right="80" w:firstLine="0" w:firstLineChars="0"/>
-              <w:rPr>
-                <w:rFonts w:ascii="Arial" w:hAnsi="Arial" w:eastAsia="Arial" w:cs="Arial"/>
+            </w:pPr>
+            <w:r>
+              <w:rPr>
+                <w:rFonts w:ascii="Arial" w:hAnsi="DejaVu Sans" w:eastAsia="DejaVu Sans" w:cs="DejaVu Sans"/>
                 <w:i w:val="false"/>
                 <w:b w:val="true"/>
                 <w:u w:val="none"/>
-                <w:strike w:val="false"/>
-                <w:sz w:val="21"/>
-                <w:szCs w:val="21"/>
-                <w:color w:val="063360"/>
-              </w:rPr>
-            </w:pPr>
-            <w:r>
-              <w:rPr>
-                <w:rFonts w:ascii="Arial" w:hAnsi="Arial" w:eastAsia="Arial" w:cs="Arial"/>
-                <w:i w:val="false"/>
-                <w:b w:val="true"/>
-                <w:u w:val="none"/>
-                <w:strike w:val="false"/>
                 <w:sz w:val="21"/>
                 <w:szCs w:val="21"/>
                 <w:color w:val="063360"/>
@@ -322,24 +286,13 @@
               </w:pBdr>
               <w:spacing w:after="80" w:before="80" w:line="240"/>
               <w:ind w:left="80" w:right="80" w:firstLine="0" w:firstLineChars="0"/>
-              <w:rPr>
-                <w:rFonts w:ascii="Arial" w:hAnsi="Arial" w:eastAsia="Arial" w:cs="Arial"/>
+            </w:pPr>
+            <w:r>
+              <w:rPr>
+                <w:rFonts w:ascii="Arial" w:hAnsi="DejaVu Sans" w:eastAsia="DejaVu Sans" w:cs="DejaVu Sans"/>
                 <w:i w:val="false"/>
                 <w:b w:val="true"/>
                 <w:u w:val="none"/>
-                <w:strike w:val="false"/>
-                <w:sz w:val="21"/>
-                <w:szCs w:val="21"/>
-                <w:color w:val="063360"/>
-              </w:rPr>
-            </w:pPr>
-            <w:r>
-              <w:rPr>
-                <w:rFonts w:ascii="Arial" w:hAnsi="Arial" w:eastAsia="Arial" w:cs="Arial"/>
-                <w:i w:val="false"/>
-                <w:b w:val="true"/>
-                <w:u w:val="none"/>
-                <w:strike w:val="false"/>
                 <w:sz w:val="21"/>
                 <w:szCs w:val="21"/>
                 <w:color w:val="063360"/>
@@ -377,24 +330,13 @@
               </w:pBdr>
               <w:spacing w:after="80" w:before="80" w:line="240"/>
               <w:ind w:left="80" w:right="80" w:firstLine="0" w:firstLineChars="0"/>
-              <w:rPr>
-                <w:rFonts w:ascii="Arial" w:hAnsi="Arial" w:eastAsia="Arial" w:cs="Arial"/>
+            </w:pPr>
+            <w:r>
+              <w:rPr>
+                <w:rFonts w:ascii="Arial" w:hAnsi="DejaVu Sans" w:eastAsia="DejaVu Sans" w:cs="DejaVu Sans"/>
                 <w:i w:val="false"/>
                 <w:b w:val="true"/>
                 <w:u w:val="none"/>
-                <w:strike w:val="false"/>
-                <w:sz w:val="21"/>
-                <w:szCs w:val="21"/>
-                <w:color w:val="063360"/>
-              </w:rPr>
-            </w:pPr>
-            <w:r>
-              <w:rPr>
-                <w:rFonts w:ascii="Arial" w:hAnsi="Arial" w:eastAsia="Arial" w:cs="Arial"/>
-                <w:i w:val="false"/>
-                <w:b w:val="true"/>
-                <w:u w:val="none"/>
-                <w:strike w:val="false"/>
                 <w:sz w:val="21"/>
                 <w:szCs w:val="21"/>
                 <w:color w:val="063360"/>
@@ -408,6 +350,7 @@
         <w:trPr>
           <w:trHeight w:val="792" w:hRule="atLeast"/>
         </w:trPr>
+        body1
         <w:tc>
           <w:tcPr>
             <w:tcBorders>
@@ -437,24 +380,13 @@
               </w:pBdr>
               <w:spacing w:after="80" w:before="80" w:line="240"/>
               <w:ind w:left="80" w:right="80" w:firstLine="0" w:firstLineChars="0"/>
-              <w:rPr>
-                <w:rFonts w:ascii="Arial" w:hAnsi="Arial" w:eastAsia="Arial" w:cs="Arial"/>
-                <w:i w:val="false"/>
-                <w:b w:val="false"/>
-                <w:u w:val="none"/>
-                <w:strike w:val="false"/>
-                <w:sz w:val="21"/>
-                <w:szCs w:val="21"/>
-                <w:color w:val="000000"/>
-              </w:rPr>
             </w:pPr>
             <w:r>
               <w:rPr>
-                <w:rFonts w:ascii="Arial" w:hAnsi="Arial" w:eastAsia="Arial" w:cs="Arial"/>
-                <w:i w:val="false"/>
-                <w:b w:val="false"/>
-                <w:u w:val="none"/>
-                <w:strike w:val="false"/>
+                <w:rFonts w:ascii="Arial" w:hAnsi="DejaVu Sans" w:eastAsia="DejaVu Sans" w:cs="DejaVu Sans"/>
+                <w:i w:val="false"/>
+                <w:b w:val="false"/>
+                <w:u w:val="none"/>
                 <w:sz w:val="21"/>
                 <w:szCs w:val="21"/>
                 <w:color w:val="000000"/>
@@ -492,24 +424,13 @@
               </w:pBdr>
               <w:spacing w:after="80" w:before="80" w:line="240"/>
               <w:ind w:left="80" w:right="80" w:firstLine="0" w:firstLineChars="0"/>
-              <w:rPr>
-                <w:rFonts w:ascii="Arial" w:hAnsi="Arial" w:eastAsia="Arial" w:cs="Arial"/>
-                <w:i w:val="false"/>
-                <w:b w:val="false"/>
-                <w:u w:val="none"/>
-                <w:strike w:val="false"/>
-                <w:sz w:val="21"/>
-                <w:szCs w:val="21"/>
-                <w:color w:val="000000"/>
-              </w:rPr>
             </w:pPr>
             <w:r>
               <w:rPr>
-                <w:rFonts w:ascii="Arial" w:hAnsi="Arial" w:eastAsia="Arial" w:cs="Arial"/>
-                <w:i w:val="false"/>
-                <w:b w:val="false"/>
-                <w:u w:val="none"/>
-                <w:strike w:val="false"/>
+                <w:rFonts w:ascii="Arial" w:hAnsi="DejaVu Sans" w:eastAsia="DejaVu Sans" w:cs="DejaVu Sans"/>
+                <w:i w:val="false"/>
+                <w:b w:val="false"/>
+                <w:u w:val="none"/>
                 <w:sz w:val="21"/>
                 <w:szCs w:val="21"/>
                 <w:color w:val="000000"/>
@@ -547,24 +468,13 @@
               </w:pBdr>
               <w:spacing w:after="80" w:before="80" w:line="240"/>
               <w:ind w:left="80" w:right="80" w:firstLine="0" w:firstLineChars="0"/>
-              <w:rPr>
-                <w:rFonts w:ascii="Arial" w:hAnsi="Arial" w:eastAsia="Arial" w:cs="Arial"/>
-                <w:i w:val="false"/>
-                <w:b w:val="false"/>
-                <w:u w:val="none"/>
-                <w:strike w:val="false"/>
-                <w:sz w:val="21"/>
-                <w:szCs w:val="21"/>
-                <w:color w:val="000000"/>
-              </w:rPr>
             </w:pPr>
             <w:r>
               <w:rPr>
-                <w:rFonts w:ascii="Arial" w:hAnsi="Arial" w:eastAsia="Arial" w:cs="Arial"/>
-                <w:i w:val="false"/>
-                <w:b w:val="false"/>
-                <w:u w:val="none"/>
-                <w:strike w:val="false"/>
+                <w:rFonts w:ascii="Arial" w:hAnsi="DejaVu Sans" w:eastAsia="DejaVu Sans" w:cs="DejaVu Sans"/>
+                <w:i w:val="false"/>
+                <w:b w:val="false"/>
+                <w:u w:val="none"/>
                 <w:sz w:val="21"/>
                 <w:szCs w:val="21"/>
                 <w:color w:val="000000"/>
@@ -602,24 +512,13 @@
               </w:pBdr>
               <w:spacing w:after="80" w:before="80" w:line="240"/>
               <w:ind w:left="80" w:right="80" w:firstLine="0" w:firstLineChars="0"/>
-              <w:rPr>
-                <w:rFonts w:ascii="Arial" w:hAnsi="Arial" w:eastAsia="Arial" w:cs="Arial"/>
-                <w:i w:val="false"/>
-                <w:b w:val="false"/>
-                <w:u w:val="none"/>
-                <w:strike w:val="false"/>
-                <w:sz w:val="21"/>
-                <w:szCs w:val="21"/>
-                <w:color w:val="000000"/>
-              </w:rPr>
             </w:pPr>
             <w:r>
               <w:rPr>
-                <w:rFonts w:ascii="Arial" w:hAnsi="Arial" w:eastAsia="Arial" w:cs="Arial"/>
-                <w:i w:val="false"/>
-                <w:b w:val="false"/>
-                <w:u w:val="none"/>
-                <w:strike w:val="false"/>
+                <w:rFonts w:ascii="Arial" w:hAnsi="DejaVu Sans" w:eastAsia="DejaVu Sans" w:cs="DejaVu Sans"/>
+                <w:i w:val="false"/>
+                <w:b w:val="false"/>
+                <w:u w:val="none"/>
                 <w:sz w:val="21"/>
                 <w:szCs w:val="21"/>
                 <w:color w:val="000000"/>
@@ -657,24 +556,13 @@
               </w:pBdr>
               <w:spacing w:after="80" w:before="80" w:line="240"/>
               <w:ind w:left="80" w:right="80" w:firstLine="0" w:firstLineChars="0"/>
-              <w:rPr>
-                <w:rFonts w:ascii="Arial" w:hAnsi="Arial" w:eastAsia="Arial" w:cs="Arial"/>
-                <w:i w:val="false"/>
-                <w:b w:val="false"/>
-                <w:u w:val="none"/>
-                <w:strike w:val="false"/>
-                <w:sz w:val="21"/>
-                <w:szCs w:val="21"/>
-                <w:color w:val="000000"/>
-              </w:rPr>
             </w:pPr>
             <w:r>
               <w:rPr>
-                <w:rFonts w:ascii="Arial" w:hAnsi="Arial" w:eastAsia="Arial" w:cs="Arial"/>
-                <w:i w:val="false"/>
-                <w:b w:val="false"/>
-                <w:u w:val="none"/>
-                <w:strike w:val="false"/>
+                <w:rFonts w:ascii="Arial" w:hAnsi="DejaVu Sans" w:eastAsia="DejaVu Sans" w:cs="DejaVu Sans"/>
+                <w:i w:val="false"/>
+                <w:b w:val="false"/>
+                <w:u w:val="none"/>
                 <w:sz w:val="21"/>
                 <w:szCs w:val="21"/>
                 <w:color w:val="000000"/>
@@ -688,6 +576,7 @@
         <w:trPr>
           <w:trHeight w:val="792" w:hRule="atLeast"/>
         </w:trPr>
+        body2
         <w:tc>
           <w:tcPr>
             <w:tcBorders>
@@ -717,24 +606,13 @@
               </w:pBdr>
               <w:spacing w:after="80" w:before="80" w:line="240"/>
               <w:ind w:left="80" w:right="80" w:firstLine="0" w:firstLineChars="0"/>
-              <w:rPr>
-                <w:rFonts w:ascii="Arial" w:hAnsi="Arial" w:eastAsia="Arial" w:cs="Arial"/>
-                <w:i w:val="false"/>
-                <w:b w:val="false"/>
-                <w:u w:val="none"/>
-                <w:strike w:val="false"/>
-                <w:sz w:val="21"/>
-                <w:szCs w:val="21"/>
-                <w:color w:val="000000"/>
-              </w:rPr>
             </w:pPr>
             <w:r>
               <w:rPr>
-                <w:rFonts w:ascii="Arial" w:hAnsi="Arial" w:eastAsia="Arial" w:cs="Arial"/>
-                <w:i w:val="false"/>
-                <w:b w:val="false"/>
-                <w:u w:val="none"/>
-                <w:strike w:val="false"/>
+                <w:rFonts w:ascii="Arial" w:hAnsi="DejaVu Sans" w:eastAsia="DejaVu Sans" w:cs="DejaVu Sans"/>
+                <w:i w:val="false"/>
+                <w:b w:val="false"/>
+                <w:u w:val="none"/>
                 <w:sz w:val="21"/>
                 <w:szCs w:val="21"/>
                 <w:color w:val="000000"/>
@@ -772,24 +650,13 @@
               </w:pBdr>
               <w:spacing w:after="80" w:before="80" w:line="240"/>
               <w:ind w:left="80" w:right="80" w:firstLine="0" w:firstLineChars="0"/>
-              <w:rPr>
-                <w:rFonts w:ascii="Arial" w:hAnsi="Arial" w:eastAsia="Arial" w:cs="Arial"/>
-                <w:i w:val="false"/>
-                <w:b w:val="false"/>
-                <w:u w:val="none"/>
-                <w:strike w:val="false"/>
-                <w:sz w:val="21"/>
-                <w:szCs w:val="21"/>
-                <w:color w:val="000000"/>
-              </w:rPr>
             </w:pPr>
             <w:r>
               <w:rPr>
-                <w:rFonts w:ascii="Arial" w:hAnsi="Arial" w:eastAsia="Arial" w:cs="Arial"/>
-                <w:i w:val="false"/>
-                <w:b w:val="false"/>
-                <w:u w:val="none"/>
-                <w:strike w:val="false"/>
+                <w:rFonts w:ascii="Arial" w:hAnsi="DejaVu Sans" w:eastAsia="DejaVu Sans" w:cs="DejaVu Sans"/>
+                <w:i w:val="false"/>
+                <w:b w:val="false"/>
+                <w:u w:val="none"/>
                 <w:sz w:val="21"/>
                 <w:szCs w:val="21"/>
                 <w:color w:val="000000"/>
@@ -827,24 +694,13 @@
               </w:pBdr>
               <w:spacing w:after="80" w:before="80" w:line="240"/>
               <w:ind w:left="80" w:right="80" w:firstLine="0" w:firstLineChars="0"/>
-              <w:rPr>
-                <w:rFonts w:ascii="Arial" w:hAnsi="Arial" w:eastAsia="Arial" w:cs="Arial"/>
-                <w:i w:val="false"/>
-                <w:b w:val="false"/>
-                <w:u w:val="none"/>
-                <w:strike w:val="false"/>
-                <w:sz w:val="21"/>
-                <w:szCs w:val="21"/>
-                <w:color w:val="000000"/>
-              </w:rPr>
             </w:pPr>
             <w:r>
               <w:rPr>
-                <w:rFonts w:ascii="Arial" w:hAnsi="Arial" w:eastAsia="Arial" w:cs="Arial"/>
-                <w:i w:val="false"/>
-                <w:b w:val="false"/>
-                <w:u w:val="none"/>
-                <w:strike w:val="false"/>
+                <w:rFonts w:ascii="Arial" w:hAnsi="DejaVu Sans" w:eastAsia="DejaVu Sans" w:cs="DejaVu Sans"/>
+                <w:i w:val="false"/>
+                <w:b w:val="false"/>
+                <w:u w:val="none"/>
                 <w:sz w:val="21"/>
                 <w:szCs w:val="21"/>
                 <w:color w:val="000000"/>
@@ -882,24 +738,13 @@
               </w:pBdr>
               <w:spacing w:after="80" w:before="80" w:line="240"/>
               <w:ind w:left="80" w:right="80" w:firstLine="0" w:firstLineChars="0"/>
-              <w:rPr>
-                <w:rFonts w:ascii="Arial" w:hAnsi="Arial" w:eastAsia="Arial" w:cs="Arial"/>
-                <w:i w:val="false"/>
-                <w:b w:val="false"/>
-                <w:u w:val="none"/>
-                <w:strike w:val="false"/>
-                <w:sz w:val="21"/>
-                <w:szCs w:val="21"/>
-                <w:color w:val="000000"/>
-              </w:rPr>
             </w:pPr>
             <w:r>
               <w:rPr>
-                <w:rFonts w:ascii="Arial" w:hAnsi="Arial" w:eastAsia="Arial" w:cs="Arial"/>
-                <w:i w:val="false"/>
-                <w:b w:val="false"/>
-                <w:u w:val="none"/>
-                <w:strike w:val="false"/>
+                <w:rFonts w:ascii="Arial" w:hAnsi="DejaVu Sans" w:eastAsia="DejaVu Sans" w:cs="DejaVu Sans"/>
+                <w:i w:val="false"/>
+                <w:b w:val="false"/>
+                <w:u w:val="none"/>
                 <w:sz w:val="21"/>
                 <w:szCs w:val="21"/>
                 <w:color w:val="000000"/>
@@ -937,24 +782,13 @@
               </w:pBdr>
               <w:spacing w:after="80" w:before="80" w:line="240"/>
               <w:ind w:left="80" w:right="80" w:firstLine="0" w:firstLineChars="0"/>
-              <w:rPr>
-                <w:rFonts w:ascii="Arial" w:hAnsi="Arial" w:eastAsia="Arial" w:cs="Arial"/>
-                <w:i w:val="false"/>
-                <w:b w:val="false"/>
-                <w:u w:val="none"/>
-                <w:strike w:val="false"/>
-                <w:sz w:val="21"/>
-                <w:szCs w:val="21"/>
-                <w:color w:val="000000"/>
-              </w:rPr>
             </w:pPr>
             <w:r>
               <w:rPr>
-                <w:rFonts w:ascii="Arial" w:hAnsi="Arial" w:eastAsia="Arial" w:cs="Arial"/>
-                <w:i w:val="false"/>
-                <w:b w:val="false"/>
-                <w:u w:val="none"/>
-                <w:strike w:val="false"/>
+                <w:rFonts w:ascii="Arial" w:hAnsi="DejaVu Sans" w:eastAsia="DejaVu Sans" w:cs="DejaVu Sans"/>
+                <w:i w:val="false"/>
+                <w:b w:val="false"/>
+                <w:u w:val="none"/>
                 <w:sz w:val="21"/>
                 <w:szCs w:val="21"/>
                 <w:color w:val="000000"/>
@@ -968,6 +802,7 @@
         <w:trPr>
           <w:trHeight w:val="792" w:hRule="atLeast"/>
         </w:trPr>
+        body3
         <w:tc>
           <w:tcPr>
             <w:tcBorders>
@@ -997,24 +832,13 @@
               </w:pBdr>
               <w:spacing w:after="80" w:before="80" w:line="240"/>
               <w:ind w:left="80" w:right="80" w:firstLine="0" w:firstLineChars="0"/>
-              <w:rPr>
-                <w:rFonts w:ascii="Arial" w:hAnsi="Arial" w:eastAsia="Arial" w:cs="Arial"/>
-                <w:i w:val="false"/>
-                <w:b w:val="false"/>
-                <w:u w:val="none"/>
-                <w:strike w:val="false"/>
-                <w:sz w:val="21"/>
-                <w:szCs w:val="21"/>
-                <w:color w:val="000000"/>
-              </w:rPr>
             </w:pPr>
             <w:r>
               <w:rPr>
-                <w:rFonts w:ascii="Arial" w:hAnsi="Arial" w:eastAsia="Arial" w:cs="Arial"/>
-                <w:i w:val="false"/>
-                <w:b w:val="false"/>
-                <w:u w:val="none"/>
-                <w:strike w:val="false"/>
+                <w:rFonts w:ascii="Arial" w:hAnsi="DejaVu Sans" w:eastAsia="DejaVu Sans" w:cs="DejaVu Sans"/>
+                <w:i w:val="false"/>
+                <w:b w:val="false"/>
+                <w:u w:val="none"/>
                 <w:sz w:val="21"/>
                 <w:szCs w:val="21"/>
                 <w:color w:val="000000"/>
@@ -1052,24 +876,13 @@
               </w:pBdr>
               <w:spacing w:after="80" w:before="80" w:line="240"/>
               <w:ind w:left="80" w:right="80" w:firstLine="0" w:firstLineChars="0"/>
-              <w:rPr>
-                <w:rFonts w:ascii="Arial" w:hAnsi="Arial" w:eastAsia="Arial" w:cs="Arial"/>
-                <w:i w:val="false"/>
-                <w:b w:val="false"/>
-                <w:u w:val="none"/>
-                <w:strike w:val="false"/>
-                <w:sz w:val="21"/>
-                <w:szCs w:val="21"/>
-                <w:color w:val="000000"/>
-              </w:rPr>
             </w:pPr>
             <w:r>
               <w:rPr>
-                <w:rFonts w:ascii="Arial" w:hAnsi="Arial" w:eastAsia="Arial" w:cs="Arial"/>
-                <w:i w:val="false"/>
-                <w:b w:val="false"/>
-                <w:u w:val="none"/>
-                <w:strike w:val="false"/>
+                <w:rFonts w:ascii="Arial" w:hAnsi="DejaVu Sans" w:eastAsia="DejaVu Sans" w:cs="DejaVu Sans"/>
+                <w:i w:val="false"/>
+                <w:b w:val="false"/>
+                <w:u w:val="none"/>
                 <w:sz w:val="21"/>
                 <w:szCs w:val="21"/>
                 <w:color w:val="000000"/>
@@ -1107,24 +920,13 @@
               </w:pBdr>
               <w:spacing w:after="80" w:before="80" w:line="240"/>
               <w:ind w:left="80" w:right="80" w:firstLine="0" w:firstLineChars="0"/>
-              <w:rPr>
-                <w:rFonts w:ascii="Arial" w:hAnsi="Arial" w:eastAsia="Arial" w:cs="Arial"/>
-                <w:i w:val="false"/>
-                <w:b w:val="false"/>
-                <w:u w:val="none"/>
-                <w:strike w:val="false"/>
-                <w:sz w:val="21"/>
-                <w:szCs w:val="21"/>
-                <w:color w:val="000000"/>
-              </w:rPr>
             </w:pPr>
             <w:r>
               <w:rPr>
-                <w:rFonts w:ascii="Arial" w:hAnsi="Arial" w:eastAsia="Arial" w:cs="Arial"/>
-                <w:i w:val="false"/>
-                <w:b w:val="false"/>
-                <w:u w:val="none"/>
-                <w:strike w:val="false"/>
+                <w:rFonts w:ascii="Arial" w:hAnsi="DejaVu Sans" w:eastAsia="DejaVu Sans" w:cs="DejaVu Sans"/>
+                <w:i w:val="false"/>
+                <w:b w:val="false"/>
+                <w:u w:val="none"/>
                 <w:sz w:val="21"/>
                 <w:szCs w:val="21"/>
                 <w:color w:val="000000"/>
@@ -1162,24 +964,13 @@
               </w:pBdr>
               <w:spacing w:after="80" w:before="80" w:line="240"/>
               <w:ind w:left="80" w:right="80" w:firstLine="0" w:firstLineChars="0"/>
-              <w:rPr>
-                <w:rFonts w:ascii="Arial" w:hAnsi="Arial" w:eastAsia="Arial" w:cs="Arial"/>
-                <w:i w:val="false"/>
-                <w:b w:val="false"/>
-                <w:u w:val="none"/>
-                <w:strike w:val="false"/>
-                <w:sz w:val="21"/>
-                <w:szCs w:val="21"/>
-                <w:color w:val="000000"/>
-              </w:rPr>
             </w:pPr>
             <w:r>
               <w:rPr>
-                <w:rFonts w:ascii="Arial" w:hAnsi="Arial" w:eastAsia="Arial" w:cs="Arial"/>
-                <w:i w:val="false"/>
-                <w:b w:val="false"/>
-                <w:u w:val="none"/>
-                <w:strike w:val="false"/>
+                <w:rFonts w:ascii="Arial" w:hAnsi="DejaVu Sans" w:eastAsia="DejaVu Sans" w:cs="DejaVu Sans"/>
+                <w:i w:val="false"/>
+                <w:b w:val="false"/>
+                <w:u w:val="none"/>
                 <w:sz w:val="21"/>
                 <w:szCs w:val="21"/>
                 <w:color w:val="000000"/>
@@ -1217,24 +1008,13 @@
               </w:pBdr>
               <w:spacing w:after="80" w:before="80" w:line="240"/>
               <w:ind w:left="80" w:right="80" w:firstLine="0" w:firstLineChars="0"/>
-              <w:rPr>
-                <w:rFonts w:ascii="Arial" w:hAnsi="Arial" w:eastAsia="Arial" w:cs="Arial"/>
-                <w:i w:val="false"/>
-                <w:b w:val="false"/>
-                <w:u w:val="none"/>
-                <w:strike w:val="false"/>
-                <w:sz w:val="21"/>
-                <w:szCs w:val="21"/>
-                <w:color w:val="000000"/>
-              </w:rPr>
             </w:pPr>
             <w:r>
               <w:rPr>
-                <w:rFonts w:ascii="Arial" w:hAnsi="Arial" w:eastAsia="Arial" w:cs="Arial"/>
-                <w:i w:val="false"/>
-                <w:b w:val="false"/>
-                <w:u w:val="none"/>
-                <w:strike w:val="false"/>
+                <w:rFonts w:ascii="Arial" w:hAnsi="DejaVu Sans" w:eastAsia="DejaVu Sans" w:cs="DejaVu Sans"/>
+                <w:i w:val="false"/>
+                <w:b w:val="false"/>
+                <w:u w:val="none"/>
                 <w:sz w:val="21"/>
                 <w:szCs w:val="21"/>
                 <w:color w:val="000000"/>
@@ -1264,7 +1044,6 @@
           <w:i w:val="false"/>
           <w:b w:val="true"/>
           <w:u w:val="none"/>
-          <w:strike w:val="false"/>
           <w:sz w:val="26"/>
           <w:szCs w:val="26"/>
           <w:color w:val="215A9E"/>
@@ -1291,7 +1070,6 @@
           <w:i w:val="false"/>
           <w:b w:val="false"/>
           <w:u w:val="none"/>
-          <w:strike w:val="false"/>
           <w:sz w:val="22"/>
           <w:szCs w:val="22"/>
           <w:color w:val="000000"/>
@@ -1318,7 +1096,6 @@
           <w:i w:val="false"/>
           <w:b w:val="false"/>
           <w:u w:val="none"/>
-          <w:strike w:val="false"/>
           <w:sz w:val="22"/>
           <w:szCs w:val="22"/>
           <w:color w:val="000000"/>
@@ -1345,7 +1122,6 @@
           <w:i w:val="false"/>
           <w:b w:val="false"/>
           <w:u w:val="none"/>
-          <w:strike w:val="false"/>
           <w:sz w:val="22"/>
           <w:szCs w:val="22"/>
           <w:color w:val="000000"/>
@@ -1372,7 +1148,6 @@
           <w:i w:val="false"/>
           <w:b w:val="true"/>
           <w:u w:val="none"/>
-          <w:strike w:val="false"/>
           <w:sz w:val="26"/>
           <w:szCs w:val="26"/>
           <w:color w:val="215A9E"/>
@@ -1399,7 +1174,6 @@
           <w:i w:val="false"/>
           <w:b w:val="false"/>
           <w:u w:val="none"/>
-          <w:strike w:val="false"/>
           <w:sz w:val="22"/>
           <w:szCs w:val="22"/>
           <w:color w:val="000000"/>
@@ -1426,7 +1200,6 @@
           <w:i w:val="false"/>
           <w:b w:val="false"/>
           <w:u w:val="none"/>
-          <w:strike w:val="false"/>
           <w:sz w:val="22"/>
           <w:szCs w:val="22"/>
           <w:color w:val="000000"/>
@@ -1453,7 +1226,6 @@
           <w:i w:val="false"/>
           <w:b w:val="false"/>
           <w:u w:val="none"/>
-          <w:strike w:val="false"/>
           <w:sz w:val="22"/>
           <w:szCs w:val="22"/>
           <w:color w:val="000000"/>
@@ -1480,7 +1252,6 @@
           <w:i w:val="false"/>
           <w:b w:val="false"/>
           <w:u w:val="none"/>
-          <w:strike w:val="false"/>
           <w:sz w:val="22"/>
           <w:szCs w:val="22"/>
           <w:color w:val="B5BEC9"/>
@@ -1507,7 +1278,6 @@
           <w:i w:val="false"/>
           <w:b w:val="false"/>
           <w:u w:val="none"/>
-          <w:strike w:val="false"/>
           <w:sz w:val="22"/>
           <w:szCs w:val="22"/>
           <w:color w:val="B5BEC9"/>
@@ -1540,7 +1310,6 @@
           <w:i w:val="false"/>
           <w:b w:val="false"/>
           <w:u w:val="none"/>
-          <w:strike w:val="false"/>
           <w:sz w:val="18"/>
           <w:szCs w:val="18"/>
           <w:color w:val="545860"/>
@@ -1567,7 +1336,6 @@
           <w:i w:val="false"/>
           <w:b w:val="true"/>
           <w:u w:val="none"/>
-          <w:strike w:val="false"/>
           <w:sz w:val="36"/>
           <w:szCs w:val="36"/>
           <w:color w:val="063360"/>
@@ -1594,12 +1362,11 @@
           <w:i w:val="true"/>
           <w:b w:val="false"/>
           <w:u w:val="none"/>
-          <w:strike w:val="false"/>
           <w:sz w:val="18"/>
           <w:szCs w:val="18"/>
           <w:color w:val="215A9E"/>
         </w:rPr>
-        <w:t xml:space="preserve">Print: 1 per pair</w:t>
+        <w:t xml:space="preserve">Print: 1 per group (8 groups), plus one green, one yellow and one red marker per group. The claim strips for the wall are at the end of this pack</w:t>
       </w:r>
     </w:p>
     <w:p>
@@ -1621,7 +1388,6 @@
           <w:i w:val="false"/>
           <w:b w:val="true"/>
           <w:u w:val="none"/>
-          <w:strike w:val="false"/>
           <w:sz w:val="22"/>
           <w:szCs w:val="22"/>
           <w:color w:val="000000"/>
@@ -1648,7 +1414,6 @@
           <w:i w:val="true"/>
           <w:b w:val="false"/>
           <w:u w:val="none"/>
-          <w:strike w:val="false"/>
           <w:sz w:val="22"/>
           <w:szCs w:val="22"/>
           <w:color w:val="000000"/>
@@ -1675,12 +1440,271 @@
           <w:i w:val="false"/>
           <w:b w:val="true"/>
           <w:u w:val="none"/>
-          <w:strike w:val="false"/>
           <w:sz w:val="26"/>
           <w:szCs w:val="26"/>
           <w:color w:val="215A9E"/>
         </w:rPr>
         <w:t xml:space="preserve">A response like this is possible</w:t>
+      </w:r>
+    </w:p>
+    <w:p>
+      <w:pPr>
+        <w:pStyle w:val="Normal"/>
+        <w:jc w:val="left"/>
+        <w:pBdr>
+          <w:bottom w:val="none" w:sz="0" w:space="0" w:color="000000"/>
+          <w:top w:val="none" w:sz="0" w:space="0" w:color="000000"/>
+          <w:left w:val="none" w:sz="0" w:space="0" w:color="000000"/>
+          <w:right w:val="none" w:sz="0" w:space="0" w:color="000000"/>
+        </w:pBdr>
+        <w:spacing w:after="60" w:before="0" w:line="240"/>
+        <w:ind w:left="0" w:right="0" w:firstLine="0" w:firstLineChars="0"/>
+      </w:pPr>
+      <w:r>
+        <w:rPr>
+          <w:rFonts w:ascii="Arial" w:hAnsi="Arial" w:eastAsia="Arial" w:cs="Arial"/>
+          <w:i w:val="false"/>
+          <w:b w:val="false"/>
+          <w:u w:val="none"/>
+          <w:sz w:val="22"/>
+          <w:szCs w:val="22"/>
+          <w:color w:val="000000"/>
+        </w:rPr>
+        <w:t xml:space="preserve">1.  The GreenWaste pilot produced a clear result: waste-management costs fell by 665 AED per business,</w:t>
+      </w:r>
+    </w:p>
+    <w:p>
+      <w:pPr>
+        <w:pStyle w:val="Normal"/>
+        <w:jc w:val="left"/>
+        <w:pBdr>
+          <w:bottom w:val="none" w:sz="0" w:space="0" w:color="000000"/>
+          <w:top w:val="none" w:sz="0" w:space="0" w:color="000000"/>
+          <w:left w:val="none" w:sz="0" w:space="0" w:color="000000"/>
+          <w:right w:val="none" w:sz="0" w:space="0" w:color="000000"/>
+        </w:pBdr>
+        <w:spacing w:after="60" w:before="0" w:line="240"/>
+        <w:ind w:left="0" w:right="0" w:firstLine="0" w:firstLineChars="0"/>
+      </w:pPr>
+      <w:r>
+        <w:rPr>
+          <w:rFonts w:ascii="Arial" w:hAnsi="Arial" w:eastAsia="Arial" w:cs="Arial"/>
+          <w:i w:val="false"/>
+          <w:b w:val="false"/>
+          <w:u w:val="none"/>
+          <w:sz w:val="22"/>
+          <w:szCs w:val="22"/>
+          <w:color w:val="000000"/>
+        </w:rPr>
+        <w:t xml:space="preserve">2.  and with p &lt; 0.001 we can be confident the programme caused this reduction.</w:t>
+      </w:r>
+    </w:p>
+    <w:p>
+      <w:pPr>
+        <w:pStyle w:val="Normal"/>
+        <w:jc w:val="left"/>
+        <w:pBdr>
+          <w:bottom w:val="none" w:sz="0" w:space="0" w:color="000000"/>
+          <w:top w:val="none" w:sz="0" w:space="0" w:color="000000"/>
+          <w:left w:val="none" w:sz="0" w:space="0" w:color="000000"/>
+          <w:right w:val="none" w:sz="0" w:space="0" w:color="000000"/>
+        </w:pBdr>
+        <w:spacing w:after="60" w:before="0" w:line="240"/>
+        <w:ind w:left="0" w:right="0" w:firstLine="0" w:firstLineChars="0"/>
+      </w:pPr>
+      <w:r>
+        <w:rPr>
+          <w:rFonts w:ascii="Arial" w:hAnsi="Arial" w:eastAsia="Arial" w:cs="Arial"/>
+          <w:i w:val="false"/>
+          <w:b w:val="false"/>
+          <w:u w:val="none"/>
+          <w:sz w:val="22"/>
+          <w:szCs w:val="22"/>
+          <w:color w:val="000000"/>
+        </w:rPr>
+        <w:t xml:space="preserve">3.  Because the same businesses were measured before and after, differences between businesses are already accounted for,</w:t>
+      </w:r>
+    </w:p>
+    <w:p>
+      <w:pPr>
+        <w:pStyle w:val="Normal"/>
+        <w:jc w:val="left"/>
+        <w:pBdr>
+          <w:bottom w:val="none" w:sz="0" w:space="0" w:color="000000"/>
+          <w:top w:val="none" w:sz="0" w:space="0" w:color="000000"/>
+          <w:left w:val="none" w:sz="0" w:space="0" w:color="000000"/>
+          <w:right w:val="none" w:sz="0" w:space="0" w:color="000000"/>
+        </w:pBdr>
+        <w:spacing w:after="60" w:before="0" w:line="240"/>
+        <w:ind w:left="0" w:right="0" w:firstLine="0" w:firstLineChars="0"/>
+      </w:pPr>
+      <w:r>
+        <w:rPr>
+          <w:rFonts w:ascii="Arial" w:hAnsi="Arial" w:eastAsia="Arial" w:cs="Arial"/>
+          <w:i w:val="false"/>
+          <w:b w:val="false"/>
+          <w:u w:val="none"/>
+          <w:sz w:val="22"/>
+          <w:szCs w:val="22"/>
+          <w:color w:val="000000"/>
+        </w:rPr>
+        <w:t xml:space="preserve">4.  so the 665 AED saving can be attributed to the programme.</w:t>
+      </w:r>
+    </w:p>
+    <w:p>
+      <w:pPr>
+        <w:pStyle w:val="Normal"/>
+        <w:jc w:val="left"/>
+        <w:pBdr>
+          <w:bottom w:val="none" w:sz="0" w:space="0" w:color="000000"/>
+          <w:top w:val="none" w:sz="0" w:space="0" w:color="000000"/>
+          <w:left w:val="none" w:sz="0" w:space="0" w:color="000000"/>
+          <w:right w:val="none" w:sz="0" w:space="0" w:color="000000"/>
+        </w:pBdr>
+        <w:spacing w:after="60" w:before="0" w:line="240"/>
+        <w:ind w:left="0" w:right="0" w:firstLine="0" w:firstLineChars="0"/>
+      </w:pPr>
+      <w:r>
+        <w:rPr>
+          <w:rFonts w:ascii="Arial" w:hAnsi="Arial" w:eastAsia="Arial" w:cs="Arial"/>
+          <w:i w:val="false"/>
+          <w:b w:val="false"/>
+          <w:u w:val="none"/>
+          <w:sz w:val="22"/>
+          <w:szCs w:val="22"/>
+          <w:color w:val="000000"/>
+        </w:rPr>
+        <w:t xml:space="preserve">5.  This makes a strong case for national scale-up.</w:t>
+      </w:r>
+    </w:p>
+    <w:p>
+      <w:pPr>
+        <w:pStyle w:val="Normal"/>
+        <w:jc w:val="left"/>
+        <w:pBdr>
+          <w:bottom w:val="none" w:sz="0" w:space="0" w:color="000000"/>
+          <w:top w:val="none" w:sz="0" w:space="0" w:color="000000"/>
+          <w:left w:val="none" w:sz="0" w:space="0" w:color="000000"/>
+          <w:right w:val="none" w:sz="0" w:space="0" w:color="000000"/>
+        </w:pBdr>
+        <w:spacing w:after="60" w:before="0" w:line="240"/>
+        <w:ind w:left="0" w:right="0" w:firstLine="0" w:firstLineChars="0"/>
+      </w:pPr>
+      <w:r>
+        <w:rPr>
+          <w:rFonts w:ascii="Arial" w:hAnsi="Arial" w:eastAsia="Arial" w:cs="Arial"/>
+          <w:i w:val="false"/>
+          <w:b w:val="false"/>
+          <w:u w:val="none"/>
+          <w:sz w:val="22"/>
+          <w:szCs w:val="22"/>
+          <w:color w:val="000000"/>
+        </w:rPr>
+        <w:t xml:space="preserve">6.  As with any pilot, results should be monitored as the programme expands.</w:t>
+      </w:r>
+    </w:p>
+    <w:p>
+      <w:pPr>
+        <w:pStyle w:val="Normal"/>
+        <w:jc w:val="left"/>
+        <w:pBdr>
+          <w:bottom w:val="none" w:sz="0" w:space="0" w:color="000000"/>
+          <w:top w:val="none" w:sz="0" w:space="0" w:color="000000"/>
+          <w:left w:val="none" w:sz="0" w:space="0" w:color="000000"/>
+          <w:right w:val="none" w:sz="0" w:space="0" w:color="000000"/>
+        </w:pBdr>
+        <w:spacing w:after="40" w:before="0" w:line="240"/>
+        <w:ind w:left="0" w:right="0" w:firstLine="0" w:firstLineChars="0"/>
+      </w:pPr>
+      <w:r>
+        <w:rPr>
+          <w:rFonts w:ascii="Arial" w:hAnsi="Arial" w:eastAsia="Arial" w:cs="Arial"/>
+          <w:i w:val="false"/>
+          <w:b w:val="true"/>
+          <w:u w:val="none"/>
+          <w:sz w:val="22"/>
+          <w:szCs w:val="22"/>
+          <w:color w:val="000000"/>
+        </w:rPr>
+        <w:t xml:space="preserve">Marker rules. At your table, mark each numbered claim with a coloured marker:</w:t>
+      </w:r>
+    </w:p>
+    <w:p>
+      <w:pPr>
+        <w:pStyle w:val="Normal"/>
+        <w:jc w:val="left"/>
+        <w:pBdr>
+          <w:bottom w:val="none" w:sz="0" w:space="0" w:color="000000"/>
+          <w:top w:val="none" w:sz="0" w:space="0" w:color="000000"/>
+          <w:left w:val="none" w:sz="0" w:space="0" w:color="000000"/>
+          <w:right w:val="none" w:sz="0" w:space="0" w:color="000000"/>
+        </w:pBdr>
+        <w:spacing w:after="20" w:before="0" w:line="240"/>
+        <w:ind w:left="0" w:right="0" w:firstLine="0" w:firstLineChars="0"/>
+      </w:pPr>
+      <w:r>
+        <w:rPr>
+          <w:rFonts w:ascii="Arial" w:hAnsi="Arial" w:eastAsia="Arial" w:cs="Arial"/>
+          <w:i w:val="false"/>
+          <w:b w:val="false"/>
+          <w:u w:val="none"/>
+          <w:sz w:val="22"/>
+          <w:szCs w:val="22"/>
+          <w:color w:val="000000"/>
+        </w:rPr>
+        <w:t xml:space="preserve">    Green: the evidence supports the claim.</w:t>
+      </w:r>
+    </w:p>
+    <w:p>
+      <w:pPr>
+        <w:pStyle w:val="Normal"/>
+        <w:jc w:val="left"/>
+        <w:pBdr>
+          <w:bottom w:val="none" w:sz="0" w:space="0" w:color="000000"/>
+          <w:top w:val="none" w:sz="0" w:space="0" w:color="000000"/>
+          <w:left w:val="none" w:sz="0" w:space="0" w:color="000000"/>
+          <w:right w:val="none" w:sz="0" w:space="0" w:color="000000"/>
+        </w:pBdr>
+        <w:spacing w:after="20" w:before="0" w:line="240"/>
+        <w:ind w:left="0" w:right="0" w:firstLine="0" w:firstLineChars="0"/>
+      </w:pPr>
+      <w:r>
+        <w:rPr>
+          <w:rFonts w:ascii="Arial" w:hAnsi="Arial" w:eastAsia="Arial" w:cs="Arial"/>
+          <w:i w:val="false"/>
+          <w:b w:val="false"/>
+          <w:u w:val="none"/>
+          <w:sz w:val="22"/>
+          <w:szCs w:val="22"/>
+          <w:color w:val="000000"/>
+        </w:rPr>
+        <w:t xml:space="preserve">    Yellow: partly true, or true but not enough to act on.</w:t>
+      </w:r>
+    </w:p>
+    <w:p>
+      <w:pPr>
+        <w:pStyle w:val="Normal"/>
+        <w:jc w:val="left"/>
+        <w:pBdr>
+          <w:bottom w:val="none" w:sz="0" w:space="0" w:color="000000"/>
+          <w:top w:val="none" w:sz="0" w:space="0" w:color="000000"/>
+          <w:left w:val="none" w:sz="0" w:space="0" w:color="000000"/>
+          <w:right w:val="none" w:sz="0" w:space="0" w:color="000000"/>
+        </w:pBdr>
+        <w:spacing w:after="20" w:before="0" w:line="240"/>
+        <w:ind w:left="0" w:right="0" w:firstLine="0" w:firstLineChars="0"/>
+      </w:pPr>
+      <w:r>
+        <w:rPr>
+          <w:rFonts w:ascii="Arial" w:hAnsi="Arial" w:eastAsia="Arial" w:cs="Arial"/>
+          <w:i w:val="false"/>
+          <w:b w:val="false"/>
+          <w:u w:val="none"/>
+          <w:sz w:val="22"/>
+          <w:szCs w:val="22"/>
+          <w:color w:val="000000"/>
+        </w:rPr>
+        <w:t xml:space="preserve">    Red: the evidence does not support the claim.</w:t>
       </w:r>
     </w:p>
     <w:p>
@@ -1700,14 +1724,13 @@
         <w:rPr>
           <w:rFonts w:ascii="Arial" w:hAnsi="Arial" w:eastAsia="Arial" w:cs="Arial"/>
           <w:i w:val="false"/>
-          <w:b w:val="false"/>
+          <w:b w:val="true"/>
           <w:u w:val="none"/>
-          <w:strike w:val="false"/>
           <w:sz w:val="22"/>
           <w:szCs w:val="22"/>
           <w:color w:val="000000"/>
         </w:rPr>
-        <w:t xml:space="preserve">The GreenWaste pilot produced a clear result: waste-management costs fell by 665 AED per business, and with p &lt; 0.001 we can be confident the programme caused this reduction. Because the same businesses were measured before and after, differences between businesses are already accounted for, so the 665 AED saving can be attributed to the programme. This makes a strong case for national scale-up. As with any pilot, results should be monitored as the programme expands.</w:t>
+        <w:t xml:space="preserve">Then one person from your group takes your colours to the claim strips on the wall and puts one dot on each strip.</w:t>
       </w:r>
     </w:p>
     <w:p>
@@ -1729,12 +1752,11 @@
           <w:i w:val="false"/>
           <w:b w:val="true"/>
           <w:u w:val="none"/>
-          <w:strike w:val="false"/>
           <w:sz w:val="22"/>
           <w:szCs w:val="22"/>
           <w:color w:val="000000"/>
         </w:rPr>
-        <w:t xml:space="preserve">Underline every claim in the response that the evidence does not support. Then run the same prompt yourselves: did your AI write something similar?</w:t>
+        <w:t xml:space="preserve">Then run the same prompt yourselves: did your AI write something similar?</w:t>
       </w:r>
     </w:p>
     <w:p>
@@ -1756,7 +1778,6 @@
           <w:i w:val="false"/>
           <w:b w:val="false"/>
           <w:u w:val="none"/>
-          <w:strike w:val="false"/>
           <w:sz w:val="22"/>
           <w:szCs w:val="22"/>
           <w:color w:val="B5BEC9"/>
@@ -1783,34 +1804,6 @@
           <w:i w:val="false"/>
           <w:b w:val="false"/>
           <w:u w:val="none"/>
-          <w:strike w:val="false"/>
-          <w:sz w:val="22"/>
-          <w:szCs w:val="22"/>
-          <w:color w:val="B5BEC9"/>
-        </w:rPr>
-        <w:t xml:space="preserve">____________________________________________________________________________</w:t>
-      </w:r>
-    </w:p>
-    <w:p>
-      <w:pPr>
-        <w:pStyle w:val="Normal"/>
-        <w:jc w:val="left"/>
-        <w:pBdr>
-          <w:bottom w:val="none" w:sz="0" w:space="0" w:color="000000"/>
-          <w:top w:val="none" w:sz="0" w:space="0" w:color="000000"/>
-          <w:left w:val="none" w:sz="0" w:space="0" w:color="000000"/>
-          <w:right w:val="none" w:sz="0" w:space="0" w:color="000000"/>
-        </w:pBdr>
-        <w:spacing w:after="120" w:before="0" w:line="240"/>
-        <w:ind w:left="0" w:right="0" w:firstLine="0" w:firstLineChars="0"/>
-      </w:pPr>
-      <w:r>
-        <w:rPr>
-          <w:rFonts w:ascii="Arial" w:hAnsi="Arial" w:eastAsia="Arial" w:cs="Arial"/>
-          <w:i w:val="false"/>
-          <w:b w:val="false"/>
-          <w:u w:val="none"/>
-          <w:strike w:val="false"/>
           <w:sz w:val="22"/>
           <w:szCs w:val="22"/>
           <w:color w:val="B5BEC9"/>
@@ -1837,7 +1830,6 @@
           <w:i w:val="false"/>
           <w:b w:val="true"/>
           <w:u w:val="none"/>
-          <w:strike w:val="false"/>
           <w:sz w:val="26"/>
           <w:szCs w:val="26"/>
           <w:color w:val="215A9E"/>
@@ -1864,7 +1856,6 @@
           <w:i w:val="true"/>
           <w:b w:val="false"/>
           <w:u w:val="none"/>
-          <w:strike w:val="false"/>
           <w:sz w:val="22"/>
           <w:szCs w:val="22"/>
           <w:color w:val="000000"/>
@@ -1891,7 +1882,6 @@
           <w:i w:val="false"/>
           <w:b w:val="false"/>
           <w:u w:val="none"/>
-          <w:strike w:val="false"/>
           <w:sz w:val="22"/>
           <w:szCs w:val="22"/>
           <w:color w:val="000000"/>
@@ -1924,7 +1914,6 @@
           <w:i w:val="false"/>
           <w:b w:val="false"/>
           <w:u w:val="none"/>
-          <w:strike w:val="false"/>
           <w:sz w:val="18"/>
           <w:szCs w:val="18"/>
           <w:color w:val="545860"/>
@@ -1951,7 +1940,6 @@
           <w:i w:val="false"/>
           <w:b w:val="true"/>
           <w:u w:val="none"/>
-          <w:strike w:val="false"/>
           <w:sz w:val="36"/>
           <w:szCs w:val="36"/>
           <w:color w:val="063360"/>
@@ -1978,7 +1966,6 @@
           <w:i w:val="true"/>
           <w:b w:val="false"/>
           <w:u w:val="none"/>
-          <w:strike w:val="false"/>
           <w:sz w:val="18"/>
           <w:szCs w:val="18"/>
           <w:color w:val="215A9E"/>
@@ -2000,6 +1987,7 @@
         <w:trPr>
           <w:trHeight w:val="3168" w:hRule="atLeast"/>
         </w:trPr>
+        body1
         <w:tc>
           <w:tcPr>
             <w:tcBorders>
@@ -2029,16 +2017,6 @@
               </w:pBdr>
               <w:spacing w:after="200" w:before="200" w:line="240"/>
               <w:ind w:left="200" w:right="200" w:firstLine="0" w:firstLineChars="0"/>
-              <w:rPr>
-                <w:rFonts w:ascii="Arial" w:hAnsi="Arial" w:eastAsia="Arial" w:cs="Arial"/>
-                <w:i w:val="false"/>
-                <w:b w:val="false"/>
-                <w:u w:val="none"/>
-                <w:strike w:val="false"/>
-                <w:sz w:val="21"/>
-                <w:szCs w:val="21"/>
-                <w:color w:val="000000"/>
-              </w:rPr>
             </w:pPr>
             <w:r>
               <w:rPr>
@@ -2046,7 +2024,6 @@
                 <w:i w:val="false"/>
                 <w:b w:val="true"/>
                 <w:u w:val="none"/>
-                <w:strike w:val="false"/>
                 <w:sz w:val="22"/>
                 <w:szCs w:val="22"/>
                 <w:color w:val="063360"/>
@@ -2059,7 +2036,6 @@
                 <w:i w:val="false"/>
                 <w:b w:val="false"/>
                 <w:u w:val="none"/>
-                <w:strike w:val="false"/>
                 <w:sz w:val="21"/>
                 <w:szCs w:val="21"/>
                 <w:color w:val="000000"/>
@@ -2072,7 +2048,6 @@
                 <w:i w:val="false"/>
                 <w:b w:val="false"/>
                 <w:u w:val="none"/>
-                <w:strike w:val="false"/>
                 <w:sz w:val="21"/>
                 <w:szCs w:val="21"/>
                 <w:color w:val="000000"/>
@@ -2085,7 +2060,6 @@
                 <w:i w:val="false"/>
                 <w:b w:val="false"/>
                 <w:u w:val="none"/>
-                <w:strike w:val="false"/>
                 <w:sz w:val="21"/>
                 <w:szCs w:val="21"/>
                 <w:color w:val="000000"/>
@@ -2098,7 +2072,6 @@
                 <w:i w:val="false"/>
                 <w:b w:val="false"/>
                 <w:u w:val="none"/>
-                <w:strike w:val="false"/>
                 <w:sz w:val="21"/>
                 <w:szCs w:val="21"/>
                 <w:color w:val="000000"/>
@@ -2111,7 +2084,6 @@
                 <w:i w:val="false"/>
                 <w:b w:val="false"/>
                 <w:u w:val="none"/>
-                <w:strike w:val="false"/>
                 <w:sz w:val="21"/>
                 <w:szCs w:val="21"/>
                 <w:color w:val="000000"/>
@@ -2124,7 +2096,6 @@
                 <w:i w:val="false"/>
                 <w:b w:val="false"/>
                 <w:u w:val="none"/>
-                <w:strike w:val="false"/>
                 <w:sz w:val="21"/>
                 <w:szCs w:val="21"/>
                 <w:color w:val="000000"/>
@@ -2137,7 +2108,6 @@
                 <w:i w:val="false"/>
                 <w:b w:val="false"/>
                 <w:u w:val="none"/>
-                <w:strike w:val="false"/>
                 <w:sz w:val="21"/>
                 <w:szCs w:val="21"/>
                 <w:color w:val="000000"/>
@@ -2150,7 +2120,6 @@
                 <w:i w:val="false"/>
                 <w:b w:val="false"/>
                 <w:u w:val="none"/>
-                <w:strike w:val="false"/>
                 <w:sz w:val="21"/>
                 <w:szCs w:val="21"/>
                 <w:color w:val="000000"/>
@@ -2163,7 +2132,6 @@
                 <w:i w:val="false"/>
                 <w:b w:val="false"/>
                 <w:u w:val="none"/>
-                <w:strike w:val="false"/>
                 <w:sz w:val="21"/>
                 <w:szCs w:val="21"/>
                 <w:color w:val="000000"/>
@@ -2176,7 +2144,6 @@
                 <w:i w:val="false"/>
                 <w:b w:val="false"/>
                 <w:u w:val="none"/>
-                <w:strike w:val="false"/>
                 <w:sz w:val="21"/>
                 <w:szCs w:val="21"/>
                 <w:color w:val="000000"/>
@@ -2189,7 +2156,6 @@
                 <w:i w:val="false"/>
                 <w:b w:val="false"/>
                 <w:u w:val="none"/>
-                <w:strike w:val="false"/>
                 <w:sz w:val="21"/>
                 <w:szCs w:val="21"/>
                 <w:color w:val="000000"/>
@@ -2227,16 +2193,6 @@
               </w:pBdr>
               <w:spacing w:after="200" w:before="200" w:line="240"/>
               <w:ind w:left="200" w:right="200" w:firstLine="0" w:firstLineChars="0"/>
-              <w:rPr>
-                <w:rFonts w:ascii="Arial" w:hAnsi="Arial" w:eastAsia="Arial" w:cs="Arial"/>
-                <w:i w:val="false"/>
-                <w:b w:val="false"/>
-                <w:u w:val="none"/>
-                <w:strike w:val="false"/>
-                <w:sz w:val="21"/>
-                <w:szCs w:val="21"/>
-                <w:color w:val="000000"/>
-              </w:rPr>
             </w:pPr>
             <w:r>
               <w:rPr>
@@ -2244,7 +2200,6 @@
                 <w:i w:val="false"/>
                 <w:b w:val="true"/>
                 <w:u w:val="none"/>
-                <w:strike w:val="false"/>
                 <w:sz w:val="22"/>
                 <w:szCs w:val="22"/>
                 <w:color w:val="063360"/>
@@ -2257,7 +2212,6 @@
                 <w:i w:val="false"/>
                 <w:b w:val="false"/>
                 <w:u w:val="none"/>
-                <w:strike w:val="false"/>
                 <w:sz w:val="21"/>
                 <w:szCs w:val="21"/>
                 <w:color w:val="000000"/>
@@ -2270,7 +2224,6 @@
                 <w:i w:val="false"/>
                 <w:b w:val="false"/>
                 <w:u w:val="none"/>
-                <w:strike w:val="false"/>
                 <w:sz w:val="21"/>
                 <w:szCs w:val="21"/>
                 <w:color w:val="000000"/>
@@ -2283,7 +2236,6 @@
                 <w:i w:val="false"/>
                 <w:b w:val="false"/>
                 <w:u w:val="none"/>
-                <w:strike w:val="false"/>
                 <w:sz w:val="21"/>
                 <w:szCs w:val="21"/>
                 <w:color w:val="000000"/>
@@ -2296,7 +2248,6 @@
                 <w:i w:val="false"/>
                 <w:b w:val="false"/>
                 <w:u w:val="none"/>
-                <w:strike w:val="false"/>
                 <w:sz w:val="21"/>
                 <w:szCs w:val="21"/>
                 <w:color w:val="000000"/>
@@ -2309,7 +2260,6 @@
                 <w:i w:val="false"/>
                 <w:b w:val="false"/>
                 <w:u w:val="none"/>
-                <w:strike w:val="false"/>
                 <w:sz w:val="21"/>
                 <w:szCs w:val="21"/>
                 <w:color w:val="000000"/>
@@ -2322,7 +2272,6 @@
                 <w:i w:val="false"/>
                 <w:b w:val="false"/>
                 <w:u w:val="none"/>
-                <w:strike w:val="false"/>
                 <w:sz w:val="21"/>
                 <w:szCs w:val="21"/>
                 <w:color w:val="000000"/>
@@ -2335,7 +2284,6 @@
                 <w:i w:val="false"/>
                 <w:b w:val="false"/>
                 <w:u w:val="none"/>
-                <w:strike w:val="false"/>
                 <w:sz w:val="21"/>
                 <w:szCs w:val="21"/>
                 <w:color w:val="000000"/>
@@ -2348,7 +2296,6 @@
                 <w:i w:val="false"/>
                 <w:b w:val="false"/>
                 <w:u w:val="none"/>
-                <w:strike w:val="false"/>
                 <w:sz w:val="21"/>
                 <w:szCs w:val="21"/>
                 <w:color w:val="000000"/>
@@ -2361,7 +2308,6 @@
                 <w:i w:val="false"/>
                 <w:b w:val="false"/>
                 <w:u w:val="none"/>
-                <w:strike w:val="false"/>
                 <w:sz w:val="21"/>
                 <w:szCs w:val="21"/>
                 <w:color w:val="000000"/>
@@ -2374,7 +2320,6 @@
                 <w:i w:val="false"/>
                 <w:b w:val="false"/>
                 <w:u w:val="none"/>
-                <w:strike w:val="false"/>
                 <w:sz w:val="21"/>
                 <w:szCs w:val="21"/>
                 <w:color w:val="000000"/>
@@ -2387,7 +2332,6 @@
                 <w:i w:val="false"/>
                 <w:b w:val="false"/>
                 <w:u w:val="none"/>
-                <w:strike w:val="false"/>
                 <w:sz w:val="21"/>
                 <w:szCs w:val="21"/>
                 <w:color w:val="000000"/>
@@ -2401,6 +2345,7 @@
         <w:trPr>
           <w:trHeight w:val="3168" w:hRule="atLeast"/>
         </w:trPr>
+        body2
         <w:tc>
           <w:tcPr>
             <w:tcBorders>
@@ -2430,16 +2375,6 @@
               </w:pBdr>
               <w:spacing w:after="200" w:before="200" w:line="240"/>
               <w:ind w:left="200" w:right="200" w:firstLine="0" w:firstLineChars="0"/>
-              <w:rPr>
-                <w:rFonts w:ascii="Arial" w:hAnsi="Arial" w:eastAsia="Arial" w:cs="Arial"/>
-                <w:i w:val="false"/>
-                <w:b w:val="false"/>
-                <w:u w:val="none"/>
-                <w:strike w:val="false"/>
-                <w:sz w:val="21"/>
-                <w:szCs w:val="21"/>
-                <w:color w:val="000000"/>
-              </w:rPr>
             </w:pPr>
             <w:r>
               <w:rPr>
@@ -2447,7 +2382,6 @@
                 <w:i w:val="false"/>
                 <w:b w:val="true"/>
                 <w:u w:val="none"/>
-                <w:strike w:val="false"/>
                 <w:sz w:val="22"/>
                 <w:szCs w:val="22"/>
                 <w:color w:val="063360"/>
@@ -2460,7 +2394,6 @@
                 <w:i w:val="false"/>
                 <w:b w:val="false"/>
                 <w:u w:val="none"/>
-                <w:strike w:val="false"/>
                 <w:sz w:val="21"/>
                 <w:szCs w:val="21"/>
                 <w:color w:val="000000"/>
@@ -2473,7 +2406,6 @@
                 <w:i w:val="false"/>
                 <w:b w:val="false"/>
                 <w:u w:val="none"/>
-                <w:strike w:val="false"/>
                 <w:sz w:val="21"/>
                 <w:szCs w:val="21"/>
                 <w:color w:val="000000"/>
@@ -2486,7 +2418,6 @@
                 <w:i w:val="false"/>
                 <w:b w:val="false"/>
                 <w:u w:val="none"/>
-                <w:strike w:val="false"/>
                 <w:sz w:val="21"/>
                 <w:szCs w:val="21"/>
                 <w:color w:val="000000"/>
@@ -2499,7 +2430,6 @@
                 <w:i w:val="false"/>
                 <w:b w:val="false"/>
                 <w:u w:val="none"/>
-                <w:strike w:val="false"/>
                 <w:sz w:val="21"/>
                 <w:szCs w:val="21"/>
                 <w:color w:val="000000"/>
@@ -2512,7 +2442,6 @@
                 <w:i w:val="false"/>
                 <w:b w:val="false"/>
                 <w:u w:val="none"/>
-                <w:strike w:val="false"/>
                 <w:sz w:val="21"/>
                 <w:szCs w:val="21"/>
                 <w:color w:val="000000"/>
@@ -2525,7 +2454,6 @@
                 <w:i w:val="false"/>
                 <w:b w:val="false"/>
                 <w:u w:val="none"/>
-                <w:strike w:val="false"/>
                 <w:sz w:val="21"/>
                 <w:szCs w:val="21"/>
                 <w:color w:val="000000"/>
@@ -2538,7 +2466,6 @@
                 <w:i w:val="false"/>
                 <w:b w:val="false"/>
                 <w:u w:val="none"/>
-                <w:strike w:val="false"/>
                 <w:sz w:val="21"/>
                 <w:szCs w:val="21"/>
                 <w:color w:val="000000"/>
@@ -2551,7 +2478,6 @@
                 <w:i w:val="false"/>
                 <w:b w:val="false"/>
                 <w:u w:val="none"/>
-                <w:strike w:val="false"/>
                 <w:sz w:val="21"/>
                 <w:szCs w:val="21"/>
                 <w:color w:val="000000"/>
@@ -2564,7 +2490,6 @@
                 <w:i w:val="false"/>
                 <w:b w:val="false"/>
                 <w:u w:val="none"/>
-                <w:strike w:val="false"/>
                 <w:sz w:val="21"/>
                 <w:szCs w:val="21"/>
                 <w:color w:val="000000"/>
@@ -2577,7 +2502,6 @@
                 <w:i w:val="false"/>
                 <w:b w:val="false"/>
                 <w:u w:val="none"/>
-                <w:strike w:val="false"/>
                 <w:sz w:val="21"/>
                 <w:szCs w:val="21"/>
                 <w:color w:val="000000"/>
@@ -2590,7 +2514,6 @@
                 <w:i w:val="false"/>
                 <w:b w:val="false"/>
                 <w:u w:val="none"/>
-                <w:strike w:val="false"/>
                 <w:sz w:val="21"/>
                 <w:szCs w:val="21"/>
                 <w:color w:val="000000"/>
@@ -2628,16 +2551,6 @@
               </w:pBdr>
               <w:spacing w:after="200" w:before="200" w:line="240"/>
               <w:ind w:left="200" w:right="200" w:firstLine="0" w:firstLineChars="0"/>
-              <w:rPr>
-                <w:rFonts w:ascii="Arial" w:hAnsi="Arial" w:eastAsia="Arial" w:cs="Arial"/>
-                <w:i w:val="false"/>
-                <w:b w:val="false"/>
-                <w:u w:val="none"/>
-                <w:strike w:val="false"/>
-                <w:sz w:val="21"/>
-                <w:szCs w:val="21"/>
-                <w:color w:val="000000"/>
-              </w:rPr>
             </w:pPr>
             <w:r>
               <w:rPr>
@@ -2645,7 +2558,6 @@
                 <w:i w:val="false"/>
                 <w:b w:val="true"/>
                 <w:u w:val="none"/>
-                <w:strike w:val="false"/>
                 <w:sz w:val="22"/>
                 <w:szCs w:val="22"/>
                 <w:color w:val="063360"/>
@@ -2658,7 +2570,6 @@
                 <w:i w:val="false"/>
                 <w:b w:val="false"/>
                 <w:u w:val="none"/>
-                <w:strike w:val="false"/>
                 <w:sz w:val="21"/>
                 <w:szCs w:val="21"/>
                 <w:color w:val="000000"/>
@@ -2671,7 +2582,6 @@
                 <w:i w:val="false"/>
                 <w:b w:val="false"/>
                 <w:u w:val="none"/>
-                <w:strike w:val="false"/>
                 <w:sz w:val="21"/>
                 <w:szCs w:val="21"/>
                 <w:color w:val="000000"/>
@@ -2684,7 +2594,6 @@
                 <w:i w:val="false"/>
                 <w:b w:val="false"/>
                 <w:u w:val="none"/>
-                <w:strike w:val="false"/>
                 <w:sz w:val="21"/>
                 <w:szCs w:val="21"/>
                 <w:color w:val="000000"/>
@@ -2697,7 +2606,6 @@
                 <w:i w:val="false"/>
                 <w:b w:val="false"/>
                 <w:u w:val="none"/>
-                <w:strike w:val="false"/>
                 <w:sz w:val="21"/>
                 <w:szCs w:val="21"/>
                 <w:color w:val="000000"/>
@@ -2710,7 +2618,6 @@
                 <w:i w:val="false"/>
                 <w:b w:val="false"/>
                 <w:u w:val="none"/>
-                <w:strike w:val="false"/>
                 <w:sz w:val="21"/>
                 <w:szCs w:val="21"/>
                 <w:color w:val="000000"/>
@@ -2723,7 +2630,6 @@
                 <w:i w:val="false"/>
                 <w:b w:val="false"/>
                 <w:u w:val="none"/>
-                <w:strike w:val="false"/>
                 <w:sz w:val="21"/>
                 <w:szCs w:val="21"/>
                 <w:color w:val="000000"/>
@@ -2736,7 +2642,6 @@
                 <w:i w:val="false"/>
                 <w:b w:val="false"/>
                 <w:u w:val="none"/>
-                <w:strike w:val="false"/>
                 <w:sz w:val="21"/>
                 <w:szCs w:val="21"/>
                 <w:color w:val="000000"/>
@@ -2749,7 +2654,6 @@
                 <w:i w:val="false"/>
                 <w:b w:val="false"/>
                 <w:u w:val="none"/>
-                <w:strike w:val="false"/>
                 <w:sz w:val="21"/>
                 <w:szCs w:val="21"/>
                 <w:color w:val="000000"/>
@@ -2762,7 +2666,6 @@
                 <w:i w:val="false"/>
                 <w:b w:val="false"/>
                 <w:u w:val="none"/>
-                <w:strike w:val="false"/>
                 <w:sz w:val="21"/>
                 <w:szCs w:val="21"/>
                 <w:color w:val="000000"/>
@@ -2775,7 +2678,6 @@
                 <w:i w:val="false"/>
                 <w:b w:val="false"/>
                 <w:u w:val="none"/>
-                <w:strike w:val="false"/>
                 <w:sz w:val="21"/>
                 <w:szCs w:val="21"/>
                 <w:color w:val="000000"/>
@@ -2788,7 +2690,6 @@
                 <w:i w:val="false"/>
                 <w:b w:val="false"/>
                 <w:u w:val="none"/>
-                <w:strike w:val="false"/>
                 <w:sz w:val="21"/>
                 <w:szCs w:val="21"/>
                 <w:color w:val="000000"/>
@@ -2802,6 +2703,7 @@
         <w:trPr>
           <w:trHeight w:val="3168" w:hRule="atLeast"/>
         </w:trPr>
+        body3
         <w:tc>
           <w:tcPr>
             <w:tcBorders>
@@ -2831,16 +2733,6 @@
               </w:pBdr>
               <w:spacing w:after="200" w:before="200" w:line="240"/>
               <w:ind w:left="200" w:right="200" w:firstLine="0" w:firstLineChars="0"/>
-              <w:rPr>
-                <w:rFonts w:ascii="Arial" w:hAnsi="Arial" w:eastAsia="Arial" w:cs="Arial"/>
-                <w:i w:val="false"/>
-                <w:b w:val="false"/>
-                <w:u w:val="none"/>
-                <w:strike w:val="false"/>
-                <w:sz w:val="21"/>
-                <w:szCs w:val="21"/>
-                <w:color w:val="000000"/>
-              </w:rPr>
             </w:pPr>
             <w:r>
               <w:rPr>
@@ -2848,7 +2740,6 @@
                 <w:i w:val="false"/>
                 <w:b w:val="true"/>
                 <w:u w:val="none"/>
-                <w:strike w:val="false"/>
                 <w:sz w:val="22"/>
                 <w:szCs w:val="22"/>
                 <w:color w:val="063360"/>
@@ -2861,7 +2752,6 @@
                 <w:i w:val="false"/>
                 <w:b w:val="false"/>
                 <w:u w:val="none"/>
-                <w:strike w:val="false"/>
                 <w:sz w:val="21"/>
                 <w:szCs w:val="21"/>
                 <w:color w:val="000000"/>
@@ -2874,7 +2764,6 @@
                 <w:i w:val="false"/>
                 <w:b w:val="false"/>
                 <w:u w:val="none"/>
-                <w:strike w:val="false"/>
                 <w:sz w:val="21"/>
                 <w:szCs w:val="21"/>
                 <w:color w:val="000000"/>
@@ -2887,7 +2776,6 @@
                 <w:i w:val="false"/>
                 <w:b w:val="false"/>
                 <w:u w:val="none"/>
-                <w:strike w:val="false"/>
                 <w:sz w:val="21"/>
                 <w:szCs w:val="21"/>
                 <w:color w:val="000000"/>
@@ -2900,7 +2788,6 @@
                 <w:i w:val="false"/>
                 <w:b w:val="false"/>
                 <w:u w:val="none"/>
-                <w:strike w:val="false"/>
                 <w:sz w:val="21"/>
                 <w:szCs w:val="21"/>
                 <w:color w:val="000000"/>
@@ -2913,7 +2800,6 @@
                 <w:i w:val="false"/>
                 <w:b w:val="false"/>
                 <w:u w:val="none"/>
-                <w:strike w:val="false"/>
                 <w:sz w:val="21"/>
                 <w:szCs w:val="21"/>
                 <w:color w:val="000000"/>
@@ -2926,7 +2812,6 @@
                 <w:i w:val="false"/>
                 <w:b w:val="false"/>
                 <w:u w:val="none"/>
-                <w:strike w:val="false"/>
                 <w:sz w:val="21"/>
                 <w:szCs w:val="21"/>
                 <w:color w:val="000000"/>
@@ -2939,7 +2824,6 @@
                 <w:i w:val="false"/>
                 <w:b w:val="false"/>
                 <w:u w:val="none"/>
-                <w:strike w:val="false"/>
                 <w:sz w:val="21"/>
                 <w:szCs w:val="21"/>
                 <w:color w:val="000000"/>
@@ -2952,7 +2836,6 @@
                 <w:i w:val="false"/>
                 <w:b w:val="false"/>
                 <w:u w:val="none"/>
-                <w:strike w:val="false"/>
                 <w:sz w:val="21"/>
                 <w:szCs w:val="21"/>
                 <w:color w:val="000000"/>
@@ -2965,7 +2848,6 @@
                 <w:i w:val="false"/>
                 <w:b w:val="false"/>
                 <w:u w:val="none"/>
-                <w:strike w:val="false"/>
                 <w:sz w:val="21"/>
                 <w:szCs w:val="21"/>
                 <w:color w:val="000000"/>
@@ -2978,7 +2860,6 @@
                 <w:i w:val="false"/>
                 <w:b w:val="false"/>
                 <w:u w:val="none"/>
-                <w:strike w:val="false"/>
                 <w:sz w:val="21"/>
                 <w:szCs w:val="21"/>
                 <w:color w:val="000000"/>
@@ -2991,7 +2872,6 @@
                 <w:i w:val="false"/>
                 <w:b w:val="false"/>
                 <w:u w:val="none"/>
-                <w:strike w:val="false"/>
                 <w:sz w:val="21"/>
                 <w:szCs w:val="21"/>
                 <w:color w:val="000000"/>
@@ -3029,16 +2909,6 @@
               </w:pBdr>
               <w:spacing w:after="200" w:before="200" w:line="240"/>
               <w:ind w:left="200" w:right="200" w:firstLine="0" w:firstLineChars="0"/>
-              <w:rPr>
-                <w:rFonts w:ascii="Arial" w:hAnsi="Arial" w:eastAsia="Arial" w:cs="Arial"/>
-                <w:i w:val="false"/>
-                <w:b w:val="false"/>
-                <w:u w:val="none"/>
-                <w:strike w:val="false"/>
-                <w:sz w:val="21"/>
-                <w:szCs w:val="21"/>
-                <w:color w:val="000000"/>
-              </w:rPr>
             </w:pPr>
             <w:r>
               <w:rPr>
@@ -3046,7 +2916,6 @@
                 <w:i w:val="false"/>
                 <w:b w:val="true"/>
                 <w:u w:val="none"/>
-                <w:strike w:val="false"/>
                 <w:sz w:val="22"/>
                 <w:szCs w:val="22"/>
                 <w:color w:val="063360"/>
@@ -3059,7 +2928,6 @@
                 <w:i w:val="false"/>
                 <w:b w:val="false"/>
                 <w:u w:val="none"/>
-                <w:strike w:val="false"/>
                 <w:sz w:val="21"/>
                 <w:szCs w:val="21"/>
                 <w:color w:val="000000"/>
@@ -3072,7 +2940,6 @@
                 <w:i w:val="false"/>
                 <w:b w:val="false"/>
                 <w:u w:val="none"/>
-                <w:strike w:val="false"/>
                 <w:sz w:val="21"/>
                 <w:szCs w:val="21"/>
                 <w:color w:val="000000"/>
@@ -3085,7 +2952,6 @@
                 <w:i w:val="false"/>
                 <w:b w:val="false"/>
                 <w:u w:val="none"/>
-                <w:strike w:val="false"/>
                 <w:sz w:val="21"/>
                 <w:szCs w:val="21"/>
                 <w:color w:val="000000"/>
@@ -3098,7 +2964,6 @@
                 <w:i w:val="false"/>
                 <w:b w:val="false"/>
                 <w:u w:val="none"/>
-                <w:strike w:val="false"/>
                 <w:sz w:val="21"/>
                 <w:szCs w:val="21"/>
                 <w:color w:val="000000"/>
@@ -3111,7 +2976,6 @@
                 <w:i w:val="false"/>
                 <w:b w:val="false"/>
                 <w:u w:val="none"/>
-                <w:strike w:val="false"/>
                 <w:sz w:val="21"/>
                 <w:szCs w:val="21"/>
                 <w:color w:val="000000"/>
@@ -3124,7 +2988,6 @@
                 <w:i w:val="false"/>
                 <w:b w:val="false"/>
                 <w:u w:val="none"/>
-                <w:strike w:val="false"/>
                 <w:sz w:val="21"/>
                 <w:szCs w:val="21"/>
                 <w:color w:val="000000"/>
@@ -3137,7 +3000,6 @@
                 <w:i w:val="false"/>
                 <w:b w:val="false"/>
                 <w:u w:val="none"/>
-                <w:strike w:val="false"/>
                 <w:sz w:val="21"/>
                 <w:szCs w:val="21"/>
                 <w:color w:val="000000"/>
@@ -3150,7 +3012,6 @@
                 <w:i w:val="false"/>
                 <w:b w:val="false"/>
                 <w:u w:val="none"/>
-                <w:strike w:val="false"/>
                 <w:sz w:val="21"/>
                 <w:szCs w:val="21"/>
                 <w:color w:val="000000"/>
@@ -3163,7 +3024,6 @@
                 <w:i w:val="false"/>
                 <w:b w:val="false"/>
                 <w:u w:val="none"/>
-                <w:strike w:val="false"/>
                 <w:sz w:val="21"/>
                 <w:szCs w:val="21"/>
                 <w:color w:val="000000"/>
@@ -3176,7 +3036,6 @@
                 <w:i w:val="false"/>
                 <w:b w:val="false"/>
                 <w:u w:val="none"/>
-                <w:strike w:val="false"/>
                 <w:sz w:val="21"/>
                 <w:szCs w:val="21"/>
                 <w:color w:val="000000"/>
@@ -3189,7 +3048,6 @@
                 <w:i w:val="false"/>
                 <w:b w:val="false"/>
                 <w:u w:val="none"/>
-                <w:strike w:val="false"/>
                 <w:sz w:val="21"/>
                 <w:szCs w:val="21"/>
                 <w:color w:val="000000"/>
@@ -3225,7 +3083,6 @@
           <w:i w:val="false"/>
           <w:b w:val="false"/>
           <w:u w:val="none"/>
-          <w:strike w:val="false"/>
           <w:sz w:val="18"/>
           <w:szCs w:val="18"/>
           <w:color w:val="545860"/>
@@ -3252,7 +3109,6 @@
           <w:i w:val="false"/>
           <w:b w:val="true"/>
           <w:u w:val="none"/>
-          <w:strike w:val="false"/>
           <w:sz w:val="36"/>
           <w:szCs w:val="36"/>
           <w:color w:val="063360"/>
@@ -3279,7 +3135,6 @@
           <w:i w:val="true"/>
           <w:b w:val="false"/>
           <w:u w:val="none"/>
-          <w:strike w:val="false"/>
           <w:sz w:val="18"/>
           <w:szCs w:val="18"/>
           <w:color w:val="215A9E"/>
@@ -3306,7 +3161,6 @@
           <w:i w:val="false"/>
           <w:b w:val="true"/>
           <w:u w:val="none"/>
-          <w:strike w:val="false"/>
           <w:sz w:val="26"/>
           <w:szCs w:val="26"/>
           <w:color w:val="215A9E"/>
@@ -3333,7 +3187,6 @@
           <w:i w:val="false"/>
           <w:b w:val="false"/>
           <w:u w:val="none"/>
-          <w:strike w:val="false"/>
           <w:sz w:val="22"/>
           <w:szCs w:val="22"/>
           <w:color w:val="000000"/>
@@ -3360,7 +3213,6 @@
           <w:i w:val="false"/>
           <w:b w:val="false"/>
           <w:u w:val="none"/>
-          <w:strike w:val="false"/>
           <w:sz w:val="22"/>
           <w:szCs w:val="22"/>
           <w:color w:val="000000"/>
@@ -3387,7 +3239,6 @@
           <w:i w:val="false"/>
           <w:b w:val="true"/>
           <w:u w:val="none"/>
-          <w:strike w:val="false"/>
           <w:sz w:val="26"/>
           <w:szCs w:val="26"/>
           <w:color w:val="215A9E"/>
@@ -3414,7 +3265,6 @@
           <w:i w:val="false"/>
           <w:b w:val="false"/>
           <w:u w:val="none"/>
-          <w:strike w:val="false"/>
           <w:sz w:val="22"/>
           <w:szCs w:val="22"/>
           <w:color w:val="000000"/>
@@ -3422,11 +3272,627 @@
         <w:t xml:space="preserve">1. Significant is not causal: p &lt; 0.001 says the fall is unlikely to be chance, not what caused it. 2. Half right: following the same businesses removes fixed differences but not what changed for everyone. 3. It reports 665 as the effect; the randomised estimate is about 1,014. 4. It recommends scale-up without asking what bar the programme must clear.</w:t>
       </w:r>
     </w:p>
-    <w:sectPr>
-      <w:pgMar w:header="708" w:bottom="1008" w:top="1008" w:right="1152" w:left="1152" w:footer="708" w:gutter="0"/>
+    <w:p>
+      <w:pPr>
+        <w:pStyle w:val="Normal"/>
+        <w:jc w:val="left"/>
+        <w:pBdr>
+          <w:bottom w:val="none" w:sz="0" w:space="0" w:color="000000"/>
+          <w:top w:val="none" w:sz="0" w:space="0" w:color="000000"/>
+          <w:left w:val="none" w:sz="0" w:space="0" w:color="000000"/>
+          <w:right w:val="none" w:sz="0" w:space="0" w:color="000000"/>
+        </w:pBdr>
+        <w:spacing w:after="60" w:before="0" w:line="240"/>
+        <w:ind w:left="0" w:right="0" w:firstLine="0" w:firstLineChars="0"/>
+      </w:pPr>
+      <w:r>
+        <w:rPr>
+          <w:rFonts w:ascii="Arial" w:hAnsi="Arial" w:eastAsia="Arial" w:cs="Arial"/>
+          <w:i w:val="false"/>
+          <w:b w:val="true"/>
+          <w:u w:val="none"/>
+          <w:sz w:val="26"/>
+          <w:szCs w:val="26"/>
+          <w:color w:val="215A9E"/>
+        </w:rPr>
+        <w:t xml:space="preserve">AI Snapshot board</w:t>
+      </w:r>
+    </w:p>
+    <w:p>
+      <w:pPr>
+        <w:pStyle w:val="Normal"/>
+        <w:jc w:val="left"/>
+        <w:pBdr>
+          <w:bottom w:val="none" w:sz="0" w:space="0" w:color="000000"/>
+          <w:top w:val="none" w:sz="0" w:space="0" w:color="000000"/>
+          <w:left w:val="none" w:sz="0" w:space="0" w:color="000000"/>
+          <w:right w:val="none" w:sz="0" w:space="0" w:color="000000"/>
+        </w:pBdr>
+        <w:spacing w:after="80" w:before="0" w:line="240"/>
+        <w:ind w:left="0" w:right="0" w:firstLine="0" w:firstLineChars="0"/>
+      </w:pPr>
+      <w:r>
+        <w:rPr>
+          <w:rFonts w:ascii="Arial" w:hAnsi="Arial" w:eastAsia="Arial" w:cs="Arial"/>
+          <w:i w:val="false"/>
+          <w:b w:val="false"/>
+          <w:u w:val="none"/>
+          <w:sz w:val="22"/>
+          <w:szCs w:val="22"/>
+          <w:color w:val="000000"/>
+        </w:rPr>
+        <w:t xml:space="preserve">Setup, before the session: tape the six claim strips (last pages of this pack) down the wall in order, with space beside each strip for eight dots. Give each group one green, one yellow and one red marker (or dot stickers in the same colours). Groups mark the claims on their handout at the table, then one person per group puts one dot on each strip.</w:t>
+      </w:r>
+    </w:p>
+    <w:p>
+      <w:pPr>
+        <w:pStyle w:val="Normal"/>
+        <w:jc w:val="left"/>
+        <w:pBdr>
+          <w:bottom w:val="none" w:sz="0" w:space="0" w:color="000000"/>
+          <w:top w:val="none" w:sz="0" w:space="0" w:color="000000"/>
+          <w:left w:val="none" w:sz="0" w:space="0" w:color="000000"/>
+          <w:right w:val="none" w:sz="0" w:space="0" w:color="000000"/>
+        </w:pBdr>
+        <w:spacing w:after="80" w:before="0" w:line="240"/>
+        <w:ind w:left="0" w:right="0" w:firstLine="0" w:firstLineChars="0"/>
+      </w:pPr>
+      <w:r>
+        <w:rPr>
+          <w:rFonts w:ascii="Arial" w:hAnsi="Arial" w:eastAsia="Arial" w:cs="Arial"/>
+          <w:i w:val="false"/>
+          <w:b w:val="false"/>
+          <w:u w:val="none"/>
+          <w:sz w:val="22"/>
+          <w:szCs w:val="22"/>
+          <w:color w:val="000000"/>
+        </w:rPr>
+        <w:t xml:space="preserve">Expected wall: strip 1 mostly green (the fall of 665 AED is in the data). Strips 2, 4 and 5 red. Strip 3 split between yellow and green: it is half right, which is the debrief's error 2, so start the debrief there. Strip 6 green or yellow: true, but a generic caveat that cannot be monitored. Read the wall before showing the debrief slide: ask the groups that disagree on strip 3 to give their reasons.</w:t>
+      </w:r>
+    </w:p>
+    <w:p>
+      <w:pPr/>
+      <w:r>
+        <w:br w:type="page"/>
+      </w:r>
+    </w:p>
+    <w:p>
+      <w:pPr>
+        <w:pStyle w:val="Normal"/>
+        <w:jc w:val="left"/>
+        <w:pBdr>
+          <w:bottom w:val="none" w:sz="0" w:space="0" w:color="000000"/>
+          <w:top w:val="none" w:sz="0" w:space="0" w:color="000000"/>
+          <w:left w:val="none" w:sz="0" w:space="0" w:color="000000"/>
+          <w:right w:val="none" w:sz="0" w:space="0" w:color="000000"/>
+        </w:pBdr>
+        <w:spacing w:after="0" w:before="0" w:line="240"/>
+        <w:ind w:left="0" w:right="0" w:firstLine="0" w:firstLineChars="0"/>
+      </w:pPr>
+      <w:r>
+        <w:rPr>
+          <w:rFonts w:ascii="Arial" w:hAnsi="Arial" w:eastAsia="Arial" w:cs="Arial"/>
+          <w:i w:val="false"/>
+          <w:b w:val="false"/>
+          <w:u w:val="none"/>
+          <w:sz w:val="18"/>
+          <w:szCs w:val="18"/>
+          <w:color w:val="545860"/>
+        </w:rPr>
+        <w:t xml:space="preserve">Module 2 · Day 1, Session 3 · Spot the Problem</w:t>
+      </w:r>
+    </w:p>
+    <w:p>
+      <w:pPr>
+        <w:pStyle w:val="Normal"/>
+        <w:jc w:val="left"/>
+        <w:pBdr>
+          <w:bottom w:val="none" w:sz="0" w:space="0" w:color="000000"/>
+          <w:top w:val="none" w:sz="0" w:space="0" w:color="000000"/>
+          <w:left w:val="none" w:sz="0" w:space="0" w:color="000000"/>
+          <w:right w:val="none" w:sz="0" w:space="0" w:color="000000"/>
+        </w:pBdr>
+        <w:spacing w:after="40" w:before="0" w:line="240"/>
+        <w:ind w:left="0" w:right="0" w:firstLine="0" w:firstLineChars="0"/>
+      </w:pPr>
+      <w:r>
+        <w:rPr>
+          <w:rFonts w:ascii="Arial" w:hAnsi="Arial" w:eastAsia="Arial" w:cs="Arial"/>
+          <w:i w:val="false"/>
+          <w:b w:val="true"/>
+          <w:u w:val="none"/>
+          <w:sz w:val="36"/>
+          <w:szCs w:val="36"/>
+          <w:color w:val="063360"/>
+        </w:rPr>
+        <w:t xml:space="preserve">Wall board: claim strips</w:t>
+      </w:r>
+    </w:p>
+    <w:p>
+      <w:pPr>
+        <w:pStyle w:val="Normal"/>
+        <w:jc w:val="left"/>
+        <w:pBdr>
+          <w:bottom w:val="none" w:sz="0" w:space="0" w:color="000000"/>
+          <w:top w:val="none" w:sz="0" w:space="0" w:color="000000"/>
+          <w:left w:val="none" w:sz="0" w:space="0" w:color="000000"/>
+          <w:right w:val="none" w:sz="0" w:space="0" w:color="000000"/>
+        </w:pBdr>
+        <w:spacing w:after="160" w:before="0" w:line="240"/>
+        <w:ind w:left="0" w:right="0" w:firstLine="0" w:firstLineChars="0"/>
+      </w:pPr>
+      <w:r>
+        <w:rPr>
+          <w:rFonts w:ascii="Arial" w:hAnsi="Arial" w:eastAsia="Arial" w:cs="Arial"/>
+          <w:i w:val="true"/>
+          <w:b w:val="false"/>
+          <w:u w:val="none"/>
+          <w:sz w:val="18"/>
+          <w:szCs w:val="18"/>
+          <w:color w:val="215A9E"/>
+        </w:rPr>
+        <w:t xml:space="preserve">Print: 1 set for the trainer, cut along the dashed lines; tape down the wall in order</w:t>
+      </w:r>
+    </w:p>
+    <w:tbl xmlns:a="http://schemas.openxmlformats.org/drawingml/2006/main" xmlns:pic="http://schemas.openxmlformats.org/drawingml/2006/picture">
+      <w:tblPr>
+        <w:tblLayout w:type="fixed"/>
+        <w:jc w:val="center"/>
+        <w:tblLook w:firstRow="1" w:lastRow="0" w:firstColumn="0" w:lastColumn="0" w:noHBand="0" w:noVBand="1"/>
+      </w:tblPr>
+      <w:tblGrid>
+        <w:gridCol w:w="9792"/>
+      </w:tblGrid>
+      <w:tr>
+        <w:trPr>
+          <w:trHeight w:val="4176" w:hRule="atLeast"/>
+        </w:trPr>
+        body1
+        <w:tc>
+          <w:tcPr>
+            <w:tcBorders>
+              <w:bottom w:val="dashed" w:sz="8" w:space="0" w:color="9AA8B8"/>
+              <w:top w:val="dashed" w:sz="8" w:space="0" w:color="9AA8B8"/>
+              <w:left w:val="dashed" w:sz="8" w:space="0" w:color="9AA8B8"/>
+              <w:right w:val="dashed" w:sz="8" w:space="0" w:color="9AA8B8"/>
+            </w:tcBorders>
+            <w:shd w:val="clear" w:color="auto" w:fill="FFFFFF"/>
+            <w:tcMar>
+              <w:top w:w="0" w:type="dxa"/>
+              <w:bottom w:w="0" w:type="dxa"/>
+              <w:left w:w="0" w:type="dxa"/>
+              <w:right w:w="0" w:type="dxa"/>
+            </w:tcMar>
+            <w:vAlign w:val="center"/>
+          </w:tcPr>
+          <w:p>
+            <w:pPr>
+              <w:pStyle w:val="Normal"/>
+              <w:jc w:val="center"/>
+              <w:pBdr>
+                <w:bottom w:val="none" w:sz="0" w:space="0" w:color="000000"/>
+                <w:top w:val="none" w:sz="0" w:space="0" w:color="000000"/>
+                <w:left w:val="none" w:sz="0" w:space="0" w:color="000000"/>
+                <w:right w:val="none" w:sz="0" w:space="0" w:color="000000"/>
+              </w:pBdr>
+              <w:spacing w:after="240" w:before="240" w:line="276"/>
+              <w:ind w:left="240" w:right="240" w:firstLine="0" w:firstLineChars="0"/>
+            </w:pPr>
+            <w:r>
+              <w:rPr>
+                <w:rFonts w:ascii="Arial" w:hAnsi="Arial" w:eastAsia="Arial" w:cs="Arial"/>
+                <w:i w:val="false"/>
+                <w:b w:val="false"/>
+                <w:u w:val="none"/>
+                <w:sz w:val="24"/>
+                <w:szCs w:val="24"/>
+                <w:color w:val="545860"/>
+              </w:rPr>
+              <w:t xml:space="preserve">Claim 1</w:t>
+            </w:r>
+            <w:r>
+              <w:rPr>
+                <w:rFonts w:ascii="Arial" w:hAnsi="Arial" w:eastAsia="Arial" w:cs="Arial"/>
+                <w:i w:val="false"/>
+                <w:b w:val="false"/>
+                <w:u w:val="none"/>
+                <w:sz w:val="24"/>
+                <w:szCs w:val="24"/>
+                <w:color w:val="545860"/>
+              </w:rPr>
+              <w:br/>
+            </w:r>
+            <w:r>
+              <w:rPr>
+                <w:rFonts w:ascii="Arial" w:hAnsi="Arial" w:eastAsia="Arial" w:cs="Arial"/>
+                <w:i w:val="false"/>
+                <w:b w:val="true"/>
+                <w:u w:val="none"/>
+                <w:sz w:val="52"/>
+                <w:szCs w:val="52"/>
+                <w:color w:val="063360"/>
+              </w:rPr>
+              <w:t xml:space="preserve">The GreenWaste pilot produced a clear result: waste-management costs fell by 665 AED per business,</w:t>
+            </w:r>
+          </w:p>
+        </w:tc>
+      </w:tr>
+      <w:tr>
+        <w:trPr>
+          <w:trHeight w:val="4176" w:hRule="atLeast"/>
+        </w:trPr>
+        body2
+        <w:tc>
+          <w:tcPr>
+            <w:tcBorders>
+              <w:bottom w:val="dashed" w:sz="8" w:space="0" w:color="9AA8B8"/>
+              <w:top w:val="dashed" w:sz="8" w:space="0" w:color="9AA8B8"/>
+              <w:left w:val="dashed" w:sz="8" w:space="0" w:color="9AA8B8"/>
+              <w:right w:val="dashed" w:sz="8" w:space="0" w:color="9AA8B8"/>
+            </w:tcBorders>
+            <w:shd w:val="clear" w:color="auto" w:fill="FFFFFF"/>
+            <w:tcMar>
+              <w:top w:w="0" w:type="dxa"/>
+              <w:bottom w:w="0" w:type="dxa"/>
+              <w:left w:w="0" w:type="dxa"/>
+              <w:right w:w="0" w:type="dxa"/>
+            </w:tcMar>
+            <w:vAlign w:val="center"/>
+          </w:tcPr>
+          <w:p>
+            <w:pPr>
+              <w:pStyle w:val="Normal"/>
+              <w:jc w:val="center"/>
+              <w:pBdr>
+                <w:bottom w:val="none" w:sz="0" w:space="0" w:color="000000"/>
+                <w:top w:val="none" w:sz="0" w:space="0" w:color="000000"/>
+                <w:left w:val="none" w:sz="0" w:space="0" w:color="000000"/>
+                <w:right w:val="none" w:sz="0" w:space="0" w:color="000000"/>
+              </w:pBdr>
+              <w:spacing w:after="240" w:before="240" w:line="276"/>
+              <w:ind w:left="240" w:right="240" w:firstLine="0" w:firstLineChars="0"/>
+            </w:pPr>
+            <w:r>
+              <w:rPr>
+                <w:rFonts w:ascii="Arial" w:hAnsi="Arial" w:eastAsia="Arial" w:cs="Arial"/>
+                <w:i w:val="false"/>
+                <w:b w:val="false"/>
+                <w:u w:val="none"/>
+                <w:sz w:val="24"/>
+                <w:szCs w:val="24"/>
+                <w:color w:val="545860"/>
+              </w:rPr>
+              <w:t xml:space="preserve">Claim 2</w:t>
+            </w:r>
+            <w:r>
+              <w:rPr>
+                <w:rFonts w:ascii="Arial" w:hAnsi="Arial" w:eastAsia="Arial" w:cs="Arial"/>
+                <w:i w:val="false"/>
+                <w:b w:val="false"/>
+                <w:u w:val="none"/>
+                <w:sz w:val="24"/>
+                <w:szCs w:val="24"/>
+                <w:color w:val="545860"/>
+              </w:rPr>
+              <w:br/>
+            </w:r>
+            <w:r>
+              <w:rPr>
+                <w:rFonts w:ascii="Arial" w:hAnsi="Arial" w:eastAsia="Arial" w:cs="Arial"/>
+                <w:i w:val="false"/>
+                <w:b w:val="true"/>
+                <w:u w:val="none"/>
+                <w:sz w:val="52"/>
+                <w:szCs w:val="52"/>
+                <w:color w:val="063360"/>
+              </w:rPr>
+              <w:t xml:space="preserve">and with p &lt; 0.001 we can be confident the programme caused this reduction.</w:t>
+            </w:r>
+          </w:p>
+        </w:tc>
+      </w:tr>
+      <w:tr>
+        <w:trPr>
+          <w:trHeight w:val="4176" w:hRule="atLeast"/>
+        </w:trPr>
+        body3
+        <w:tc>
+          <w:tcPr>
+            <w:tcBorders>
+              <w:bottom w:val="dashed" w:sz="8" w:space="0" w:color="9AA8B8"/>
+              <w:top w:val="dashed" w:sz="8" w:space="0" w:color="9AA8B8"/>
+              <w:left w:val="dashed" w:sz="8" w:space="0" w:color="9AA8B8"/>
+              <w:right w:val="dashed" w:sz="8" w:space="0" w:color="9AA8B8"/>
+            </w:tcBorders>
+            <w:shd w:val="clear" w:color="auto" w:fill="FFFFFF"/>
+            <w:tcMar>
+              <w:top w:w="0" w:type="dxa"/>
+              <w:bottom w:w="0" w:type="dxa"/>
+              <w:left w:w="0" w:type="dxa"/>
+              <w:right w:w="0" w:type="dxa"/>
+            </w:tcMar>
+            <w:vAlign w:val="center"/>
+          </w:tcPr>
+          <w:p>
+            <w:pPr>
+              <w:pStyle w:val="Normal"/>
+              <w:jc w:val="center"/>
+              <w:pBdr>
+                <w:bottom w:val="none" w:sz="0" w:space="0" w:color="000000"/>
+                <w:top w:val="none" w:sz="0" w:space="0" w:color="000000"/>
+                <w:left w:val="none" w:sz="0" w:space="0" w:color="000000"/>
+                <w:right w:val="none" w:sz="0" w:space="0" w:color="000000"/>
+              </w:pBdr>
+              <w:spacing w:after="240" w:before="240" w:line="276"/>
+              <w:ind w:left="240" w:right="240" w:firstLine="0" w:firstLineChars="0"/>
+            </w:pPr>
+            <w:r>
+              <w:rPr>
+                <w:rFonts w:ascii="Arial" w:hAnsi="Arial" w:eastAsia="Arial" w:cs="Arial"/>
+                <w:i w:val="false"/>
+                <w:b w:val="false"/>
+                <w:u w:val="none"/>
+                <w:sz w:val="24"/>
+                <w:szCs w:val="24"/>
+                <w:color w:val="545860"/>
+              </w:rPr>
+              <w:t xml:space="preserve">Claim 3</w:t>
+            </w:r>
+            <w:r>
+              <w:rPr>
+                <w:rFonts w:ascii="Arial" w:hAnsi="Arial" w:eastAsia="Arial" w:cs="Arial"/>
+                <w:i w:val="false"/>
+                <w:b w:val="false"/>
+                <w:u w:val="none"/>
+                <w:sz w:val="24"/>
+                <w:szCs w:val="24"/>
+                <w:color w:val="545860"/>
+              </w:rPr>
+              <w:br/>
+            </w:r>
+            <w:r>
+              <w:rPr>
+                <w:rFonts w:ascii="Arial" w:hAnsi="Arial" w:eastAsia="Arial" w:cs="Arial"/>
+                <w:i w:val="false"/>
+                <w:b w:val="true"/>
+                <w:u w:val="none"/>
+                <w:sz w:val="52"/>
+                <w:szCs w:val="52"/>
+                <w:color w:val="063360"/>
+              </w:rPr>
+              <w:t xml:space="preserve">Because the same businesses were measured before and after, differences between businesses are already accounted for,</w:t>
+            </w:r>
+          </w:p>
+        </w:tc>
+      </w:tr>
+      <w:tr>
+        <w:trPr>
+          <w:trHeight w:val="4176" w:hRule="atLeast"/>
+        </w:trPr>
+        body4
+        <w:tc>
+          <w:tcPr>
+            <w:tcBorders>
+              <w:bottom w:val="dashed" w:sz="8" w:space="0" w:color="9AA8B8"/>
+              <w:top w:val="dashed" w:sz="8" w:space="0" w:color="9AA8B8"/>
+              <w:left w:val="dashed" w:sz="8" w:space="0" w:color="9AA8B8"/>
+              <w:right w:val="dashed" w:sz="8" w:space="0" w:color="9AA8B8"/>
+            </w:tcBorders>
+            <w:shd w:val="clear" w:color="auto" w:fill="FFFFFF"/>
+            <w:tcMar>
+              <w:top w:w="0" w:type="dxa"/>
+              <w:bottom w:w="0" w:type="dxa"/>
+              <w:left w:w="0" w:type="dxa"/>
+              <w:right w:w="0" w:type="dxa"/>
+            </w:tcMar>
+            <w:vAlign w:val="center"/>
+          </w:tcPr>
+          <w:p>
+            <w:pPr>
+              <w:pStyle w:val="Normal"/>
+              <w:jc w:val="center"/>
+              <w:pBdr>
+                <w:bottom w:val="none" w:sz="0" w:space="0" w:color="000000"/>
+                <w:top w:val="none" w:sz="0" w:space="0" w:color="000000"/>
+                <w:left w:val="none" w:sz="0" w:space="0" w:color="000000"/>
+                <w:right w:val="none" w:sz="0" w:space="0" w:color="000000"/>
+              </w:pBdr>
+              <w:spacing w:after="240" w:before="240" w:line="276"/>
+              <w:ind w:left="240" w:right="240" w:firstLine="0" w:firstLineChars="0"/>
+            </w:pPr>
+            <w:r>
+              <w:rPr>
+                <w:rFonts w:ascii="Arial" w:hAnsi="Arial" w:eastAsia="Arial" w:cs="Arial"/>
+                <w:i w:val="false"/>
+                <w:b w:val="false"/>
+                <w:u w:val="none"/>
+                <w:sz w:val="24"/>
+                <w:szCs w:val="24"/>
+                <w:color w:val="545860"/>
+              </w:rPr>
+              <w:t xml:space="preserve">Claim 4</w:t>
+            </w:r>
+            <w:r>
+              <w:rPr>
+                <w:rFonts w:ascii="Arial" w:hAnsi="Arial" w:eastAsia="Arial" w:cs="Arial"/>
+                <w:i w:val="false"/>
+                <w:b w:val="false"/>
+                <w:u w:val="none"/>
+                <w:sz w:val="24"/>
+                <w:szCs w:val="24"/>
+                <w:color w:val="545860"/>
+              </w:rPr>
+              <w:br/>
+            </w:r>
+            <w:r>
+              <w:rPr>
+                <w:rFonts w:ascii="Arial" w:hAnsi="Arial" w:eastAsia="Arial" w:cs="Arial"/>
+                <w:i w:val="false"/>
+                <w:b w:val="true"/>
+                <w:u w:val="none"/>
+                <w:sz w:val="52"/>
+                <w:szCs w:val="52"/>
+                <w:color w:val="063360"/>
+              </w:rPr>
+              <w:t xml:space="preserve">so the 665 AED saving can be attributed to the programme.</w:t>
+            </w:r>
+          </w:p>
+        </w:tc>
+      </w:tr>
+      <w:tr>
+        <w:trPr>
+          <w:trHeight w:val="4176" w:hRule="atLeast"/>
+        </w:trPr>
+        body5
+        <w:tc>
+          <w:tcPr>
+            <w:tcBorders>
+              <w:bottom w:val="dashed" w:sz="8" w:space="0" w:color="9AA8B8"/>
+              <w:top w:val="dashed" w:sz="8" w:space="0" w:color="9AA8B8"/>
+              <w:left w:val="dashed" w:sz="8" w:space="0" w:color="9AA8B8"/>
+              <w:right w:val="dashed" w:sz="8" w:space="0" w:color="9AA8B8"/>
+            </w:tcBorders>
+            <w:shd w:val="clear" w:color="auto" w:fill="FFFFFF"/>
+            <w:tcMar>
+              <w:top w:w="0" w:type="dxa"/>
+              <w:bottom w:w="0" w:type="dxa"/>
+              <w:left w:w="0" w:type="dxa"/>
+              <w:right w:w="0" w:type="dxa"/>
+            </w:tcMar>
+            <w:vAlign w:val="center"/>
+          </w:tcPr>
+          <w:p>
+            <w:pPr>
+              <w:pStyle w:val="Normal"/>
+              <w:jc w:val="center"/>
+              <w:pBdr>
+                <w:bottom w:val="none" w:sz="0" w:space="0" w:color="000000"/>
+                <w:top w:val="none" w:sz="0" w:space="0" w:color="000000"/>
+                <w:left w:val="none" w:sz="0" w:space="0" w:color="000000"/>
+                <w:right w:val="none" w:sz="0" w:space="0" w:color="000000"/>
+              </w:pBdr>
+              <w:spacing w:after="240" w:before="240" w:line="276"/>
+              <w:ind w:left="240" w:right="240" w:firstLine="0" w:firstLineChars="0"/>
+            </w:pPr>
+            <w:r>
+              <w:rPr>
+                <w:rFonts w:ascii="Arial" w:hAnsi="Arial" w:eastAsia="Arial" w:cs="Arial"/>
+                <w:i w:val="false"/>
+                <w:b w:val="false"/>
+                <w:u w:val="none"/>
+                <w:sz w:val="24"/>
+                <w:szCs w:val="24"/>
+                <w:color w:val="545860"/>
+              </w:rPr>
+              <w:t xml:space="preserve">Claim 5</w:t>
+            </w:r>
+            <w:r>
+              <w:rPr>
+                <w:rFonts w:ascii="Arial" w:hAnsi="Arial" w:eastAsia="Arial" w:cs="Arial"/>
+                <w:i w:val="false"/>
+                <w:b w:val="false"/>
+                <w:u w:val="none"/>
+                <w:sz w:val="24"/>
+                <w:szCs w:val="24"/>
+                <w:color w:val="545860"/>
+              </w:rPr>
+              <w:br/>
+            </w:r>
+            <w:r>
+              <w:rPr>
+                <w:rFonts w:ascii="Arial" w:hAnsi="Arial" w:eastAsia="Arial" w:cs="Arial"/>
+                <w:i w:val="false"/>
+                <w:b w:val="true"/>
+                <w:u w:val="none"/>
+                <w:sz w:val="52"/>
+                <w:szCs w:val="52"/>
+                <w:color w:val="063360"/>
+              </w:rPr>
+              <w:t xml:space="preserve">This makes a strong case for national scale-up.</w:t>
+            </w:r>
+          </w:p>
+        </w:tc>
+      </w:tr>
+      <w:tr>
+        <w:trPr>
+          <w:trHeight w:val="4176" w:hRule="atLeast"/>
+        </w:trPr>
+        body6
+        <w:tc>
+          <w:tcPr>
+            <w:tcBorders>
+              <w:bottom w:val="dashed" w:sz="8" w:space="0" w:color="9AA8B8"/>
+              <w:top w:val="dashed" w:sz="8" w:space="0" w:color="9AA8B8"/>
+              <w:left w:val="dashed" w:sz="8" w:space="0" w:color="9AA8B8"/>
+              <w:right w:val="dashed" w:sz="8" w:space="0" w:color="9AA8B8"/>
+            </w:tcBorders>
+            <w:shd w:val="clear" w:color="auto" w:fill="FFFFFF"/>
+            <w:tcMar>
+              <w:top w:w="0" w:type="dxa"/>
+              <w:bottom w:w="0" w:type="dxa"/>
+              <w:left w:w="0" w:type="dxa"/>
+              <w:right w:w="0" w:type="dxa"/>
+            </w:tcMar>
+            <w:vAlign w:val="center"/>
+          </w:tcPr>
+          <w:p>
+            <w:pPr>
+              <w:pStyle w:val="Normal"/>
+              <w:jc w:val="center"/>
+              <w:pBdr>
+                <w:bottom w:val="none" w:sz="0" w:space="0" w:color="000000"/>
+                <w:top w:val="none" w:sz="0" w:space="0" w:color="000000"/>
+                <w:left w:val="none" w:sz="0" w:space="0" w:color="000000"/>
+                <w:right w:val="none" w:sz="0" w:space="0" w:color="000000"/>
+              </w:pBdr>
+              <w:spacing w:after="240" w:before="240" w:line="276"/>
+              <w:ind w:left="240" w:right="240" w:firstLine="0" w:firstLineChars="0"/>
+            </w:pPr>
+            <w:r>
+              <w:rPr>
+                <w:rFonts w:ascii="Arial" w:hAnsi="Arial" w:eastAsia="Arial" w:cs="Arial"/>
+                <w:i w:val="false"/>
+                <w:b w:val="false"/>
+                <w:u w:val="none"/>
+                <w:sz w:val="24"/>
+                <w:szCs w:val="24"/>
+                <w:color w:val="545860"/>
+              </w:rPr>
+              <w:t xml:space="preserve">Claim 6</w:t>
+            </w:r>
+            <w:r>
+              <w:rPr>
+                <w:rFonts w:ascii="Arial" w:hAnsi="Arial" w:eastAsia="Arial" w:cs="Arial"/>
+                <w:i w:val="false"/>
+                <w:b w:val="false"/>
+                <w:u w:val="none"/>
+                <w:sz w:val="24"/>
+                <w:szCs w:val="24"/>
+                <w:color w:val="545860"/>
+              </w:rPr>
+              <w:br/>
+            </w:r>
+            <w:r>
+              <w:rPr>
+                <w:rFonts w:ascii="Arial" w:hAnsi="Arial" w:eastAsia="Arial" w:cs="Arial"/>
+                <w:i w:val="false"/>
+                <w:b w:val="true"/>
+                <w:u w:val="none"/>
+                <w:sz w:val="52"/>
+                <w:szCs w:val="52"/>
+                <w:color w:val="063360"/>
+              </w:rPr>
+              <w:t xml:space="preserve">As with any pilot, results should be monitored as the programme expands.</w:t>
+            </w:r>
+          </w:p>
+        </w:tc>
+      </w:tr>
+    </w:tbl>
+    <w:sectPr w:officer="true">
+      <w:pgMar w:header="720" w:bottom="1008" w:top="1008" w:right="1152" w:left="1152" w:footer="720" w:gutter="720"/>
       <w:pgSz w:h="16838" w:w="11906" w:orient="portrait"/>
+      <w:cols/>
       <w:type w:val="continuous"/>
-      <w:cols/>
     </w:sectPr>
   </w:body>
 </w:document>

</xml_diff>

<commit_message>
Oct12 S3 on the simple GreenWaste case
The session now opens with the city-map introduction instead of recalling
Module 1 numbers participants never saw. Before-and-after (-670) and
with-and-without (-1,503) come from the rest of the city; the lottery,
the balance check and the randomised estimate (-1,014, interval -1,086 to
-941) from the pilot district. The neighbourhood-clustering slide is gone;
the lottery sliders draw businesses. Every quoted number comes from
greenwaste_case.R.

The Oct12 S3 pack follows (tracker without "Module 1 said" or
neighbourhoods, AI page and key with the new numbers, card question 3).
make_case_brief.R also writes GreenWaste_case_card.docx, the picture card
handed out with the introduction; the detailed case sheet is handed out at
the close.

Co-Authored-By: Claude Opus 5.5 <noreply@anthropic.com>
</commit_message>
<xml_diff>
--- a/Module_2_Oct_2026_v2/Oct12_session3_materials.docx
+++ b/Module_2_Oct_2026_v2/Oct12_session3_materials.docx
@@ -107,7 +107,7 @@
           <w:szCs w:val="22"/>
           <w:color w:val="000000"/>
         </w:rPr>
-        <w:t xml:space="preserve">In Module 1 you saw three GreenWaste numbers. Today the trainer recalculates each number from the data. Your task: decide what is wrong with each number. The decision rule for national scale-up: the programme must save at least 1,000 AED per business.</w:t>
+        <w:t xml:space="preserve">Today the trainer calculates three GreenWaste numbers from the data. Your task: decide what is wrong with each one. The decision rule for national scale-up: the programme must save at least 1,000 AED per business per year.</w:t>
       </w:r>
     </w:p>
     <w:tbl xmlns:a="http://schemas.openxmlformats.org/drawingml/2006/main" xmlns:pic="http://schemas.openxmlformats.org/drawingml/2006/picture">
@@ -117,17 +117,17 @@
         <w:tblLook w:firstRow="1" w:lastRow="0" w:firstColumn="0" w:lastColumn="0" w:noHBand="0" w:noVBand="1"/>
       </w:tblPr>
       <w:tblGrid>
-        <w:gridCol w:w="2592"/>
+        <w:gridCol w:w="3312"/>
         <w:gridCol w:w="1440"/>
-        <w:gridCol w:w="1296"/>
-        <w:gridCol w:w="2160"/>
-        <w:gridCol w:w="2592"/>
+        <w:gridCol w:w="2304"/>
+        <w:gridCol w:w="3024"/>
       </w:tblGrid>
       <w:tr>
         <w:trPr>
           <w:trHeight w:val="360" w:hRule="auto"/>
           <w:tblHeader/>
         </w:trPr>
+        header1
         <w:tc>
           <w:tcPr>
             <w:tcBorders>
@@ -147,7 +147,6 @@
           </w:tcPr>
           <w:p>
             <w:pPr>
-              <w:pStyle w:val="Normal"/>
               <w:jc w:val="left"/>
               <w:pBdr>
                 <w:bottom w:val="none" w:sz="0" w:space="0" w:color="000000"/>
@@ -202,7 +201,6 @@
           </w:tcPr>
           <w:p>
             <w:pPr>
-              <w:pStyle w:val="Normal"/>
               <w:jc w:val="left"/>
               <w:pBdr>
                 <w:bottom w:val="none" w:sz="0" w:space="0" w:color="000000"/>
@@ -234,7 +232,7 @@
                 <w:szCs w:val="21"/>
                 <w:color w:val="063360"/>
               </w:rPr>
-              <w:t xml:space="preserve">Module 1 said</w:t>
+              <w:t xml:space="preserve">The number</w:t>
             </w:r>
           </w:p>
         </w:tc>
@@ -257,7 +255,6 @@
           </w:tcPr>
           <w:p>
             <w:pPr>
-              <w:pStyle w:val="Normal"/>
               <w:jc w:val="left"/>
               <w:pBdr>
                 <w:bottom w:val="none" w:sz="0" w:space="0" w:color="000000"/>
@@ -289,7 +286,7 @@
                 <w:szCs w:val="21"/>
                 <w:color w:val="063360"/>
               </w:rPr>
-              <w:t xml:space="preserve">Today's number</w:t>
+              <w:t xml:space="preserve">Too big, too small, or about right?</w:t>
             </w:r>
           </w:p>
         </w:tc>
@@ -312,7 +309,6 @@
           </w:tcPr>
           <w:p>
             <w:pPr>
-              <w:pStyle w:val="Normal"/>
               <w:jc w:val="left"/>
               <w:pBdr>
                 <w:bottom w:val="none" w:sz="0" w:space="0" w:color="000000"/>
@@ -344,61 +340,6 @@
                 <w:szCs w:val="21"/>
                 <w:color w:val="063360"/>
               </w:rPr>
-              <w:t xml:space="preserve">Too big, too small, or about right?</w:t>
-            </w:r>
-          </w:p>
-        </w:tc>
-        <w:tc>
-          <w:tcPr>
-            <w:tcBorders>
-              <w:bottom w:val="single" w:sz="8" w:space="0" w:color="063360"/>
-              <w:top w:val="single" w:sz="12" w:space="0" w:color="063360"/>
-              <w:left w:val="none" w:sz="0" w:space="0" w:color="000000"/>
-              <w:right w:val="none" w:sz="0" w:space="0" w:color="000000"/>
-            </w:tcBorders>
-            <w:shd w:val="clear" w:color="auto" w:fill="FFFFFF"/>
-            <w:tcMar>
-              <w:top w:w="0" w:type="dxa"/>
-              <w:bottom w:w="0" w:type="dxa"/>
-              <w:left w:w="0" w:type="dxa"/>
-              <w:right w:w="0" w:type="dxa"/>
-            </w:tcMar>
-            <w:vAlign w:val="center"/>
-          </w:tcPr>
-          <w:p>
-            <w:pPr>
-              <w:pStyle w:val="Normal"/>
-              <w:jc w:val="left"/>
-              <w:pBdr>
-                <w:bottom w:val="none" w:sz="0" w:space="0" w:color="000000"/>
-                <w:top w:val="none" w:sz="0" w:space="0" w:color="000000"/>
-                <w:left w:val="none" w:sz="0" w:space="0" w:color="000000"/>
-                <w:right w:val="none" w:sz="0" w:space="0" w:color="000000"/>
-              </w:pBdr>
-              <w:spacing w:after="80" w:before="80" w:line="240"/>
-              <w:ind w:left="80" w:right="80" w:firstLine="0" w:firstLineChars="0"/>
-              <w:rPr>
-                <w:rFonts w:ascii="Arial" w:hAnsi="Arial" w:eastAsia="Arial" w:cs="Arial"/>
-                <w:i w:val="false"/>
-                <w:b w:val="true"/>
-                <w:u w:val="none"/>
-                <w:strike w:val="false"/>
-                <w:sz w:val="21"/>
-                <w:szCs w:val="21"/>
-                <w:color w:val="063360"/>
-              </w:rPr>
-            </w:pPr>
-            <w:r>
-              <w:rPr>
-                <w:rFonts w:ascii="Arial" w:hAnsi="Arial" w:eastAsia="Arial" w:cs="Arial"/>
-                <w:i w:val="false"/>
-                <w:b w:val="true"/>
-                <w:u w:val="none"/>
-                <w:strike w:val="false"/>
-                <w:sz w:val="21"/>
-                <w:szCs w:val="21"/>
-                <w:color w:val="063360"/>
-              </w:rPr>
               <w:t xml:space="preserve">Why?</w:t>
             </w:r>
           </w:p>
@@ -408,6 +349,7 @@
         <w:trPr>
           <w:trHeight w:val="792" w:hRule="atLeast"/>
         </w:trPr>
+        body1
         <w:tc>
           <w:tcPr>
             <w:tcBorders>
@@ -427,7 +369,6 @@
           </w:tcPr>
           <w:p>
             <w:pPr>
-              <w:pStyle w:val="Normal"/>
               <w:jc w:val="left"/>
               <w:pBdr>
                 <w:bottom w:val="none" w:sz="0" w:space="0" w:color="000000"/>
@@ -459,7 +400,7 @@
                 <w:szCs w:val="21"/>
                 <w:color w:val="000000"/>
               </w:rPr>
-              <w:t xml:space="preserve">Before and after</w:t>
+              <w:t xml:space="preserve">Before and after (rest of the city)</w:t>
             </w:r>
           </w:p>
         </w:tc>
@@ -482,7 +423,6 @@
           </w:tcPr>
           <w:p>
             <w:pPr>
-              <w:pStyle w:val="Normal"/>
               <w:jc w:val="left"/>
               <w:pBdr>
                 <w:bottom w:val="none" w:sz="0" w:space="0" w:color="000000"/>
@@ -514,7 +454,7 @@
                 <w:szCs w:val="21"/>
                 <w:color w:val="000000"/>
               </w:rPr>
-              <w:t xml:space="preserve">-665</w:t>
+              <w:t xml:space="preserve"/>
             </w:r>
           </w:p>
         </w:tc>
@@ -537,7 +477,6 @@
           </w:tcPr>
           <w:p>
             <w:pPr>
-              <w:pStyle w:val="Normal"/>
               <w:jc w:val="left"/>
               <w:pBdr>
                 <w:bottom w:val="none" w:sz="0" w:space="0" w:color="000000"/>
@@ -592,7 +531,6 @@
           </w:tcPr>
           <w:p>
             <w:pPr>
-              <w:pStyle w:val="Normal"/>
               <w:jc w:val="left"/>
               <w:pBdr>
                 <w:bottom w:val="none" w:sz="0" w:space="0" w:color="000000"/>
@@ -628,66 +566,12 @@
             </w:r>
           </w:p>
         </w:tc>
-        <w:tc>
-          <w:tcPr>
-            <w:tcBorders>
-              <w:bottom w:val="single" w:sz="6" w:space="0" w:color="9AA8B8"/>
-              <w:top w:val="single" w:sz="8" w:space="0" w:color="063360"/>
-              <w:left w:val="none" w:sz="0" w:space="0" w:color="000000"/>
-              <w:right w:val="none" w:sz="0" w:space="0" w:color="000000"/>
-            </w:tcBorders>
-            <w:shd w:val="clear" w:color="auto" w:fill="FFFFFF"/>
-            <w:tcMar>
-              <w:top w:w="0" w:type="dxa"/>
-              <w:bottom w:w="0" w:type="dxa"/>
-              <w:left w:w="0" w:type="dxa"/>
-              <w:right w:w="0" w:type="dxa"/>
-            </w:tcMar>
-            <w:vAlign w:val="center"/>
-          </w:tcPr>
-          <w:p>
-            <w:pPr>
-              <w:pStyle w:val="Normal"/>
-              <w:jc w:val="left"/>
-              <w:pBdr>
-                <w:bottom w:val="none" w:sz="0" w:space="0" w:color="000000"/>
-                <w:top w:val="none" w:sz="0" w:space="0" w:color="000000"/>
-                <w:left w:val="none" w:sz="0" w:space="0" w:color="000000"/>
-                <w:right w:val="none" w:sz="0" w:space="0" w:color="000000"/>
-              </w:pBdr>
-              <w:spacing w:after="80" w:before="80" w:line="240"/>
-              <w:ind w:left="80" w:right="80" w:firstLine="0" w:firstLineChars="0"/>
-              <w:rPr>
-                <w:rFonts w:ascii="Arial" w:hAnsi="Arial" w:eastAsia="Arial" w:cs="Arial"/>
-                <w:i w:val="false"/>
-                <w:b w:val="false"/>
-                <w:u w:val="none"/>
-                <w:strike w:val="false"/>
-                <w:sz w:val="21"/>
-                <w:szCs w:val="21"/>
-                <w:color w:val="000000"/>
-              </w:rPr>
-            </w:pPr>
-            <w:r>
-              <w:rPr>
-                <w:rFonts w:ascii="Arial" w:hAnsi="Arial" w:eastAsia="Arial" w:cs="Arial"/>
-                <w:i w:val="false"/>
-                <w:b w:val="false"/>
-                <w:u w:val="none"/>
-                <w:strike w:val="false"/>
-                <w:sz w:val="21"/>
-                <w:szCs w:val="21"/>
-                <w:color w:val="000000"/>
-              </w:rPr>
-              <w:t xml:space="preserve"/>
-            </w:r>
-          </w:p>
-        </w:tc>
       </w:tr>
       <w:tr>
         <w:trPr>
           <w:trHeight w:val="792" w:hRule="atLeast"/>
         </w:trPr>
+        body2
         <w:tc>
           <w:tcPr>
             <w:tcBorders>
@@ -707,7 +591,6 @@
           </w:tcPr>
           <w:p>
             <w:pPr>
-              <w:pStyle w:val="Normal"/>
               <w:jc w:val="left"/>
               <w:pBdr>
                 <w:bottom w:val="none" w:sz="0" w:space="0" w:color="000000"/>
@@ -739,7 +622,7 @@
                 <w:szCs w:val="21"/>
                 <w:color w:val="000000"/>
               </w:rPr>
-              <w:t xml:space="preserve">Enrolled vs not enrolled</w:t>
+              <w:t xml:space="preserve">Took part vs did not (rest of the city)</w:t>
             </w:r>
           </w:p>
         </w:tc>
@@ -762,7 +645,6 @@
           </w:tcPr>
           <w:p>
             <w:pPr>
-              <w:pStyle w:val="Normal"/>
               <w:jc w:val="left"/>
               <w:pBdr>
                 <w:bottom w:val="none" w:sz="0" w:space="0" w:color="000000"/>
@@ -794,7 +676,7 @@
                 <w:szCs w:val="21"/>
                 <w:color w:val="000000"/>
               </w:rPr>
-              <w:t xml:space="preserve">-1,447</w:t>
+              <w:t xml:space="preserve"/>
             </w:r>
           </w:p>
         </w:tc>
@@ -817,7 +699,6 @@
           </w:tcPr>
           <w:p>
             <w:pPr>
-              <w:pStyle w:val="Normal"/>
               <w:jc w:val="left"/>
               <w:pBdr>
                 <w:bottom w:val="none" w:sz="0" w:space="0" w:color="000000"/>
@@ -872,7 +753,6 @@
           </w:tcPr>
           <w:p>
             <w:pPr>
-              <w:pStyle w:val="Normal"/>
               <w:jc w:val="left"/>
               <w:pBdr>
                 <w:bottom w:val="none" w:sz="0" w:space="0" w:color="000000"/>
@@ -905,6 +785,66 @@
                 <w:color w:val="000000"/>
               </w:rPr>
               <w:t xml:space="preserve"/>
+            </w:r>
+          </w:p>
+        </w:tc>
+      </w:tr>
+      <w:tr>
+        <w:trPr>
+          <w:trHeight w:val="792" w:hRule="atLeast"/>
+        </w:trPr>
+        body3
+        <w:tc>
+          <w:tcPr>
+            <w:tcBorders>
+              <w:bottom w:val="single" w:sz="6" w:space="0" w:color="9AA8B8"/>
+              <w:top w:val="single" w:sz="6" w:space="0" w:color="9AA8B8"/>
+              <w:left w:val="none" w:sz="0" w:space="0" w:color="000000"/>
+              <w:right w:val="none" w:sz="0" w:space="0" w:color="000000"/>
+            </w:tcBorders>
+            <w:shd w:val="clear" w:color="auto" w:fill="FFFFFF"/>
+            <w:tcMar>
+              <w:top w:w="0" w:type="dxa"/>
+              <w:bottom w:w="0" w:type="dxa"/>
+              <w:left w:w="0" w:type="dxa"/>
+              <w:right w:w="0" w:type="dxa"/>
+            </w:tcMar>
+            <w:vAlign w:val="center"/>
+          </w:tcPr>
+          <w:p>
+            <w:pPr>
+              <w:jc w:val="left"/>
+              <w:pBdr>
+                <w:bottom w:val="none" w:sz="0" w:space="0" w:color="000000"/>
+                <w:top w:val="none" w:sz="0" w:space="0" w:color="000000"/>
+                <w:left w:val="none" w:sz="0" w:space="0" w:color="000000"/>
+                <w:right w:val="none" w:sz="0" w:space="0" w:color="000000"/>
+              </w:pBdr>
+              <w:spacing w:after="80" w:before="80" w:line="240"/>
+              <w:ind w:left="80" w:right="80" w:firstLine="0" w:firstLineChars="0"/>
+              <w:rPr>
+                <w:rFonts w:ascii="Arial" w:hAnsi="Arial" w:eastAsia="Arial" w:cs="Arial"/>
+                <w:i w:val="false"/>
+                <w:b w:val="false"/>
+                <w:u w:val="none"/>
+                <w:strike w:val="false"/>
+                <w:sz w:val="21"/>
+                <w:szCs w:val="21"/>
+                <w:color w:val="000000"/>
+              </w:rPr>
+            </w:pPr>
+            <w:r>
+              <w:rPr>
+                <w:rFonts w:ascii="Arial" w:hAnsi="Arial" w:eastAsia="Arial" w:cs="Arial"/>
+                <w:i w:val="false"/>
+                <w:b w:val="false"/>
+                <w:u w:val="none"/>
+                <w:strike w:val="false"/>
+                <w:sz w:val="21"/>
+                <w:szCs w:val="21"/>
+                <w:color w:val="000000"/>
+              </w:rPr>
+              <w:t xml:space="preserve">Randomised (the pilot district lottery)</w:t>
             </w:r>
           </w:p>
         </w:tc>
@@ -927,7 +867,6 @@
           </w:tcPr>
           <w:p>
             <w:pPr>
-              <w:pStyle w:val="Normal"/>
               <w:jc w:val="left"/>
               <w:pBdr>
                 <w:bottom w:val="none" w:sz="0" w:space="0" w:color="000000"/>
@@ -960,66 +899,6 @@
                 <w:color w:val="000000"/>
               </w:rPr>
               <w:t xml:space="preserve"/>
-            </w:r>
-          </w:p>
-        </w:tc>
-      </w:tr>
-      <w:tr>
-        <w:trPr>
-          <w:trHeight w:val="792" w:hRule="atLeast"/>
-        </w:trPr>
-        <w:tc>
-          <w:tcPr>
-            <w:tcBorders>
-              <w:bottom w:val="single" w:sz="6" w:space="0" w:color="9AA8B8"/>
-              <w:top w:val="single" w:sz="6" w:space="0" w:color="9AA8B8"/>
-              <w:left w:val="none" w:sz="0" w:space="0" w:color="000000"/>
-              <w:right w:val="none" w:sz="0" w:space="0" w:color="000000"/>
-            </w:tcBorders>
-            <w:shd w:val="clear" w:color="auto" w:fill="FFFFFF"/>
-            <w:tcMar>
-              <w:top w:w="0" w:type="dxa"/>
-              <w:bottom w:w="0" w:type="dxa"/>
-              <w:left w:w="0" w:type="dxa"/>
-              <w:right w:w="0" w:type="dxa"/>
-            </w:tcMar>
-            <w:vAlign w:val="center"/>
-          </w:tcPr>
-          <w:p>
-            <w:pPr>
-              <w:pStyle w:val="Normal"/>
-              <w:jc w:val="left"/>
-              <w:pBdr>
-                <w:bottom w:val="none" w:sz="0" w:space="0" w:color="000000"/>
-                <w:top w:val="none" w:sz="0" w:space="0" w:color="000000"/>
-                <w:left w:val="none" w:sz="0" w:space="0" w:color="000000"/>
-                <w:right w:val="none" w:sz="0" w:space="0" w:color="000000"/>
-              </w:pBdr>
-              <w:spacing w:after="80" w:before="80" w:line="240"/>
-              <w:ind w:left="80" w:right="80" w:firstLine="0" w:firstLineChars="0"/>
-              <w:rPr>
-                <w:rFonts w:ascii="Arial" w:hAnsi="Arial" w:eastAsia="Arial" w:cs="Arial"/>
-                <w:i w:val="false"/>
-                <w:b w:val="false"/>
-                <w:u w:val="none"/>
-                <w:strike w:val="false"/>
-                <w:sz w:val="21"/>
-                <w:szCs w:val="21"/>
-                <w:color w:val="000000"/>
-              </w:rPr>
-            </w:pPr>
-            <w:r>
-              <w:rPr>
-                <w:rFonts w:ascii="Arial" w:hAnsi="Arial" w:eastAsia="Arial" w:cs="Arial"/>
-                <w:i w:val="false"/>
-                <w:b w:val="false"/>
-                <w:u w:val="none"/>
-                <w:strike w:val="false"/>
-                <w:sz w:val="21"/>
-                <w:szCs w:val="21"/>
-                <w:color w:val="000000"/>
-              </w:rPr>
-              <w:t xml:space="preserve">Randomised (drawn neighbourhoods)</w:t>
             </w:r>
           </w:p>
         </w:tc>
@@ -1042,7 +921,6 @@
           </w:tcPr>
           <w:p>
             <w:pPr>
-              <w:pStyle w:val="Normal"/>
               <w:jc w:val="left"/>
               <w:pBdr>
                 <w:bottom w:val="none" w:sz="0" w:space="0" w:color="000000"/>
@@ -1074,7 +952,7 @@
                 <w:szCs w:val="21"/>
                 <w:color w:val="000000"/>
               </w:rPr>
-              <w:t xml:space="preserve">-1,014</w:t>
+              <w:t xml:space="preserve"/>
             </w:r>
           </w:p>
         </w:tc>
@@ -1097,117 +975,6 @@
           </w:tcPr>
           <w:p>
             <w:pPr>
-              <w:pStyle w:val="Normal"/>
-              <w:jc w:val="left"/>
-              <w:pBdr>
-                <w:bottom w:val="none" w:sz="0" w:space="0" w:color="000000"/>
-                <w:top w:val="none" w:sz="0" w:space="0" w:color="000000"/>
-                <w:left w:val="none" w:sz="0" w:space="0" w:color="000000"/>
-                <w:right w:val="none" w:sz="0" w:space="0" w:color="000000"/>
-              </w:pBdr>
-              <w:spacing w:after="80" w:before="80" w:line="240"/>
-              <w:ind w:left="80" w:right="80" w:firstLine="0" w:firstLineChars="0"/>
-              <w:rPr>
-                <w:rFonts w:ascii="Arial" w:hAnsi="Arial" w:eastAsia="Arial" w:cs="Arial"/>
-                <w:i w:val="false"/>
-                <w:b w:val="false"/>
-                <w:u w:val="none"/>
-                <w:strike w:val="false"/>
-                <w:sz w:val="21"/>
-                <w:szCs w:val="21"/>
-                <w:color w:val="000000"/>
-              </w:rPr>
-            </w:pPr>
-            <w:r>
-              <w:rPr>
-                <w:rFonts w:ascii="Arial" w:hAnsi="Arial" w:eastAsia="Arial" w:cs="Arial"/>
-                <w:i w:val="false"/>
-                <w:b w:val="false"/>
-                <w:u w:val="none"/>
-                <w:strike w:val="false"/>
-                <w:sz w:val="21"/>
-                <w:szCs w:val="21"/>
-                <w:color w:val="000000"/>
-              </w:rPr>
-              <w:t xml:space="preserve"/>
-            </w:r>
-          </w:p>
-        </w:tc>
-        <w:tc>
-          <w:tcPr>
-            <w:tcBorders>
-              <w:bottom w:val="single" w:sz="6" w:space="0" w:color="9AA8B8"/>
-              <w:top w:val="single" w:sz="6" w:space="0" w:color="9AA8B8"/>
-              <w:left w:val="none" w:sz="0" w:space="0" w:color="000000"/>
-              <w:right w:val="none" w:sz="0" w:space="0" w:color="000000"/>
-            </w:tcBorders>
-            <w:shd w:val="clear" w:color="auto" w:fill="FFFFFF"/>
-            <w:tcMar>
-              <w:top w:w="0" w:type="dxa"/>
-              <w:bottom w:w="0" w:type="dxa"/>
-              <w:left w:w="0" w:type="dxa"/>
-              <w:right w:w="0" w:type="dxa"/>
-            </w:tcMar>
-            <w:vAlign w:val="center"/>
-          </w:tcPr>
-          <w:p>
-            <w:pPr>
-              <w:pStyle w:val="Normal"/>
-              <w:jc w:val="left"/>
-              <w:pBdr>
-                <w:bottom w:val="none" w:sz="0" w:space="0" w:color="000000"/>
-                <w:top w:val="none" w:sz="0" w:space="0" w:color="000000"/>
-                <w:left w:val="none" w:sz="0" w:space="0" w:color="000000"/>
-                <w:right w:val="none" w:sz="0" w:space="0" w:color="000000"/>
-              </w:pBdr>
-              <w:spacing w:after="80" w:before="80" w:line="240"/>
-              <w:ind w:left="80" w:right="80" w:firstLine="0" w:firstLineChars="0"/>
-              <w:rPr>
-                <w:rFonts w:ascii="Arial" w:hAnsi="Arial" w:eastAsia="Arial" w:cs="Arial"/>
-                <w:i w:val="false"/>
-                <w:b w:val="false"/>
-                <w:u w:val="none"/>
-                <w:strike w:val="false"/>
-                <w:sz w:val="21"/>
-                <w:szCs w:val="21"/>
-                <w:color w:val="000000"/>
-              </w:rPr>
-            </w:pPr>
-            <w:r>
-              <w:rPr>
-                <w:rFonts w:ascii="Arial" w:hAnsi="Arial" w:eastAsia="Arial" w:cs="Arial"/>
-                <w:i w:val="false"/>
-                <w:b w:val="false"/>
-                <w:u w:val="none"/>
-                <w:strike w:val="false"/>
-                <w:sz w:val="21"/>
-                <w:szCs w:val="21"/>
-                <w:color w:val="000000"/>
-              </w:rPr>
-              <w:t xml:space="preserve"/>
-            </w:r>
-          </w:p>
-        </w:tc>
-        <w:tc>
-          <w:tcPr>
-            <w:tcBorders>
-              <w:bottom w:val="single" w:sz="6" w:space="0" w:color="9AA8B8"/>
-              <w:top w:val="single" w:sz="6" w:space="0" w:color="9AA8B8"/>
-              <w:left w:val="none" w:sz="0" w:space="0" w:color="000000"/>
-              <w:right w:val="none" w:sz="0" w:space="0" w:color="000000"/>
-            </w:tcBorders>
-            <w:shd w:val="clear" w:color="auto" w:fill="FFFFFF"/>
-            <w:tcMar>
-              <w:top w:w="0" w:type="dxa"/>
-              <w:bottom w:w="0" w:type="dxa"/>
-              <w:left w:w="0" w:type="dxa"/>
-              <w:right w:w="0" w:type="dxa"/>
-            </w:tcMar>
-            <w:vAlign w:val="center"/>
-          </w:tcPr>
-          <w:p>
-            <w:pPr>
-              <w:pStyle w:val="Normal"/>
               <w:jc w:val="left"/>
               <w:pBdr>
                 <w:bottom w:val="none" w:sz="0" w:space="0" w:color="000000"/>
@@ -1296,7 +1063,7 @@
           <w:szCs w:val="22"/>
           <w:color w:val="000000"/>
         </w:rPr>
-        <w:t xml:space="preserve">The trainer draws the offered neighbourhoods at random five times. Each time, look at the difference in costs before the programme between offered and not-offered neighbourhoods. Write the largest difference:  ________ AED</w:t>
+        <w:t xml:space="preserve">The trainer draws the pilot lottery again five times. Each time, look at the difference in costs before the programme between the businesses picked and the ones not picked. Write the largest difference:  ________ AED</w:t>
       </w:r>
     </w:p>
     <w:p>
@@ -1323,7 +1090,7 @@
           <w:szCs w:val="22"/>
           <w:color w:val="000000"/>
         </w:rPr>
-        <w:t xml:space="preserve">The same difference when officials choose the neighbourhoods instead:  ________ AED</w:t>
+        <w:t xml:space="preserve">The same difference when officials choose the businesses instead:  ________ AED</w:t>
       </w:r>
     </w:p>
     <w:p>
@@ -1350,7 +1117,7 @@
           <w:szCs w:val="22"/>
           <w:color w:val="000000"/>
         </w:rPr>
-        <w:t xml:space="preserve">With 4 neighbourhoods in the lottery, in 95 out of 100 draws the starting difference is smaller than ± ________ AED. With 196 neighbourhoods: ± ________ AED.</w:t>
+        <w:t xml:space="preserve">With 4 businesses in the lottery, in 95 out of 100 draws the starting difference is smaller than ± ________ AED. With 400 businesses: ± ________ AED.</w:t>
       </w:r>
     </w:p>
     <w:p>
@@ -1404,7 +1171,7 @@
           <w:szCs w:val="22"/>
           <w:color w:val="000000"/>
         </w:rPr>
-        <w:t xml:space="preserve">The effect of the programme: ________ AED.   The 95% confidence interval for the effect (standard errors clustered by neighbourhood): ________ to ________</w:t>
+        <w:t xml:space="preserve">The effect of the programme: ________ AED.   The 95% confidence interval for the effect: ________ to ________</w:t>
       </w:r>
     </w:p>
     <w:p>
@@ -1653,7 +1420,7 @@
           <w:szCs w:val="22"/>
           <w:color w:val="000000"/>
         </w:rPr>
-        <w:t xml:space="preserve">"Our pilot cut waste costs by 665 AED per business (costs before vs after, p &lt; 0.001). Write a short paragraph for the minister on what this shows."</w:t>
+        <w:t xml:space="preserve">"Our pilot cut waste costs by 670 AED per business (costs before vs after, p &lt; 0.001). Write a short paragraph for the minister on what this shows."</w:t>
       </w:r>
     </w:p>
     <w:p>
@@ -1707,7 +1474,7 @@
           <w:szCs w:val="22"/>
           <w:color w:val="000000"/>
         </w:rPr>
-        <w:t xml:space="preserve">The GreenWaste pilot produced a clear result: waste-management costs fell by 665 AED per business, and with p &lt; 0.001 we can be confident the programme caused this reduction. Because the same businesses were measured before and after, differences between businesses are already accounted for, so the 665 AED saving can be attributed to the programme. This makes a strong case for national scale-up. As with any pilot, results should be monitored as the programme expands.</w:t>
+        <w:t xml:space="preserve">The GreenWaste pilot produced a clear result: waste-management costs fell by 670 AED per business, and with p &lt; 0.001 we can be confident the programme caused this reduction. Because the same businesses were measured before and after, differences between businesses are already accounted for, so the 670 AED saving can be attributed to the programme. This makes a strong case for national scale-up. As with any pilot, results should be monitored as the programme expands.</w:t>
       </w:r>
     </w:p>
     <w:p>
@@ -1869,7 +1636,7 @@
           <w:szCs w:val="22"/>
           <w:color w:val="000000"/>
         </w:rPr>
-        <w:t xml:space="preserve">"Costs for participating businesses were 665 AED lower after the pilot than before (p &lt; 0.001). We also have businesses that did not take part and a randomised comparison. The scale-up rule is at least 1,000 AED. Before writing anything, tell me what this before-and-after number can and cannot show. Ask me questions before you answer."</w:t>
+        <w:t xml:space="preserve">"Costs for participating businesses were 670 AED lower after the pilot than before (p &lt; 0.001). We also have businesses that did not take part and a randomised comparison. The scale-up rule is at least 1,000 AED. Before writing anything, tell me what this before-and-after number can and cannot show. Ask me questions before you answer."</w:t>
       </w:r>
     </w:p>
     <w:p>
@@ -1896,7 +1663,7 @@
           <w:szCs w:val="22"/>
           <w:color w:val="000000"/>
         </w:rPr>
-        <w:t xml:space="preserve">Which answer checks whether 665 AED is a fair measure of the effect before writing the paragraph? Paste the better answer into a new chat and ask the AI to check that answer for errors.</w:t>
+        <w:t xml:space="preserve">Which answer checks whether 670 AED is a fair measure of the effect before writing the paragraph? Paste the better answer into a new chat and ask the AI to check that answer for errors.</w:t>
       </w:r>
     </w:p>
     <w:p>
@@ -2000,6 +1767,7 @@
         <w:trPr>
           <w:trHeight w:val="3168" w:hRule="atLeast"/>
         </w:trPr>
+        body1
         <w:tc>
           <w:tcPr>
             <w:tcBorders>
@@ -2019,7 +1787,6 @@
           </w:tcPr>
           <w:p>
             <w:pPr>
-              <w:pStyle w:val="Normal"/>
               <w:jc w:val="left"/>
               <w:pBdr>
                 <w:bottom w:val="none" w:sz="0" w:space="0" w:color="000000"/>
@@ -2129,7 +1896,7 @@
                 <w:szCs w:val="21"/>
                 <w:color w:val="000000"/>
               </w:rPr>
-              <w:t xml:space="preserve">3. Were standard errors clustered at the level you randomised? Does the whole confidence interval meet our decision rule?</w:t>
+              <w:t xml:space="preserve">3. How many units were randomised? Does the whole confidence interval meet our decision rule?</w:t>
             </w:r>
             <w:r>
               <w:rPr>
@@ -2217,7 +1984,6 @@
           </w:tcPr>
           <w:p>
             <w:pPr>
-              <w:pStyle w:val="Normal"/>
               <w:jc w:val="left"/>
               <w:pBdr>
                 <w:bottom w:val="none" w:sz="0" w:space="0" w:color="000000"/>
@@ -2327,7 +2093,7 @@
                 <w:szCs w:val="21"/>
                 <w:color w:val="000000"/>
               </w:rPr>
-              <w:t xml:space="preserve">3. Were standard errors clustered at the level you randomised? Does the whole confidence interval meet our decision rule?</w:t>
+              <w:t xml:space="preserve">3. How many units were randomised? Does the whole confidence interval meet our decision rule?</w:t>
             </w:r>
             <w:r>
               <w:rPr>
@@ -2401,6 +2167,7 @@
         <w:trPr>
           <w:trHeight w:val="3168" w:hRule="atLeast"/>
         </w:trPr>
+        body2
         <w:tc>
           <w:tcPr>
             <w:tcBorders>
@@ -2420,7 +2187,6 @@
           </w:tcPr>
           <w:p>
             <w:pPr>
-              <w:pStyle w:val="Normal"/>
               <w:jc w:val="left"/>
               <w:pBdr>
                 <w:bottom w:val="none" w:sz="0" w:space="0" w:color="000000"/>
@@ -2530,7 +2296,7 @@
                 <w:szCs w:val="21"/>
                 <w:color w:val="000000"/>
               </w:rPr>
-              <w:t xml:space="preserve">3. Were standard errors clustered at the level you randomised? Does the whole confidence interval meet our decision rule?</w:t>
+              <w:t xml:space="preserve">3. How many units were randomised? Does the whole confidence interval meet our decision rule?</w:t>
             </w:r>
             <w:r>
               <w:rPr>
@@ -2618,7 +2384,6 @@
           </w:tcPr>
           <w:p>
             <w:pPr>
-              <w:pStyle w:val="Normal"/>
               <w:jc w:val="left"/>
               <w:pBdr>
                 <w:bottom w:val="none" w:sz="0" w:space="0" w:color="000000"/>
@@ -2728,7 +2493,7 @@
                 <w:szCs w:val="21"/>
                 <w:color w:val="000000"/>
               </w:rPr>
-              <w:t xml:space="preserve">3. Were standard errors clustered at the level you randomised? Does the whole confidence interval meet our decision rule?</w:t>
+              <w:t xml:space="preserve">3. How many units were randomised? Does the whole confidence interval meet our decision rule?</w:t>
             </w:r>
             <w:r>
               <w:rPr>
@@ -2802,6 +2567,7 @@
         <w:trPr>
           <w:trHeight w:val="3168" w:hRule="atLeast"/>
         </w:trPr>
+        body3
         <w:tc>
           <w:tcPr>
             <w:tcBorders>
@@ -2821,7 +2587,6 @@
           </w:tcPr>
           <w:p>
             <w:pPr>
-              <w:pStyle w:val="Normal"/>
               <w:jc w:val="left"/>
               <w:pBdr>
                 <w:bottom w:val="none" w:sz="0" w:space="0" w:color="000000"/>
@@ -2931,7 +2696,7 @@
                 <w:szCs w:val="21"/>
                 <w:color w:val="000000"/>
               </w:rPr>
-              <w:t xml:space="preserve">3. Were standard errors clustered at the level you randomised? Does the whole confidence interval meet our decision rule?</w:t>
+              <w:t xml:space="preserve">3. How many units were randomised? Does the whole confidence interval meet our decision rule?</w:t>
             </w:r>
             <w:r>
               <w:rPr>
@@ -3019,7 +2784,6 @@
           </w:tcPr>
           <w:p>
             <w:pPr>
-              <w:pStyle w:val="Normal"/>
               <w:jc w:val="left"/>
               <w:pBdr>
                 <w:bottom w:val="none" w:sz="0" w:space="0" w:color="000000"/>
@@ -3129,7 +2893,7 @@
                 <w:szCs w:val="21"/>
                 <w:color w:val="000000"/>
               </w:rPr>
-              <w:t xml:space="preserve">3. Were standard errors clustered at the level you randomised? Does the whole confidence interval meet our decision rule?</w:t>
+              <w:t xml:space="preserve">3. How many units were randomised? Does the whole confidence interval meet our decision rule?</w:t>
             </w:r>
             <w:r>
               <w:rPr>
@@ -3338,7 +3102,7 @@
           <w:szCs w:val="22"/>
           <w:color w:val="000000"/>
         </w:rPr>
-        <w:t xml:space="preserve">Before and after -665: too small; costs for non-participants rose about 150 AED, so the fall understates the effect. Enrolled vs not -1,447: too big; the groups differed by -630 AED before the programme. Randomised -1,014: fair. Interval counted by neighbourhood about -1,093 to -935: the estimate clears 1,000, the interval spans it.</w:t>
+        <w:t xml:space="preserve">Before and after -670: too small; costs for city businesses that did not take part rose about 148 AED, so the fall understates the effect. Took part vs did not -1,503: too big; the groups differed by -685 AED before the programme. Randomised -1,014: fair. 95% interval -1,086 to -941: the estimate clears 1,000, the interval spans it.</w:t>
       </w:r>
     </w:p>
     <w:p>
@@ -3365,7 +3129,7 @@
           <w:szCs w:val="22"/>
           <w:color w:val="000000"/>
         </w:rPr>
-        <w:t xml:space="preserve">Lottery: random draws start within a few dozen AED; officials picking the cheapest-to-run neighbourhoods start hundreds of AED ahead. 4 neighbourhoods: about ± 400 AED; 196: a few dozen.</w:t>
+        <w:t xml:space="preserve">Lottery: random draws among the 400 pilot businesses start within a few dozen AED; officials picking the cheapest-to-run businesses start about 436 AED apart. 4 businesses: about ± 538 AED; 400: about ± 55 AED.</w:t>
       </w:r>
     </w:p>
     <w:p>
@@ -3419,7 +3183,7 @@
           <w:szCs w:val="22"/>
           <w:color w:val="000000"/>
         </w:rPr>
-        <w:t xml:space="preserve">1. Significant is not causal: p &lt; 0.001 says the fall is unlikely to be chance, not what caused it. 2. Half right: following the same businesses removes fixed differences but not what changed for everyone. 3. It reports 665 as the effect; the randomised estimate is about 1,014. 4. It recommends scale-up without asking what bar the programme must clear.</w:t>
+        <w:t xml:space="preserve">1. Significant is not causal: p &lt; 0.001 says the fall is unlikely to be chance, not what caused it. 2. Half right: following the same businesses removes fixed differences but not what changed for everyone. 3. It reports 670 as the effect; the randomised estimate is about 1,014. 4. It recommends scale-up without asking what bar the programme must clear.</w:t>
       </w:r>
     </w:p>
     <w:sectPr>

</xml_diff>